<commit_message>
Freeze SRS ARS DRS and six passing digital IPOS blocks
Preserve snap-73c872b1307b6adb5eaf843e and current contracts, gates, approvals and centralized authority. Main Controller and Sensor-Hub remain BLOCKED; Stage 6 remains partial. All 18 published MD/DOCX outputs have zero inline review markers. Reports and appendices remain review-only, not authority. No further semantic or architecture work started.
</commit_message>
<xml_diff>
--- a/artifacts/stage5_drs/digital_requirements_specification.docx
+++ b/artifacts/stage5_drs/digital_requirements_specification.docx
@@ -2,7 +2,7 @@
 <file path=word/document.xml><?xml version="1.0" encoding="utf-8"?>
 <w:document xmlns:r="http://schemas.openxmlformats.org/officeDocument/2006/relationships" xmlns:w="http://schemas.openxmlformats.org/wordprocessingml/2006/main">
   <w:body>
-    <w:bookmarkStart w:id="115" w:name="digital-requirements-specification"/>
+    <w:bookmarkStart w:id="119" w:name="digital-requirements-specification"/>
     <w:p>
       <w:pPr>
         <w:pStyle w:val="Heading1"/>
@@ -49,7 +49,7 @@
         <w:pStyle w:val="BodyText"/>
       </w:pPr>
       <w:r>
-        <w:t xml:space="preserve">Date: 2026-10-09</w:t>
+        <w:t xml:space="preserve">Date: 2026-10-12</w:t>
       </w:r>
     </w:p>
     <w:p>
@@ -434,6 +434,40 @@
       <w:pPr>
         <w:pStyle w:val="Compact"/>
         <w:numPr>
+          <w:ilvl w:val="2"/>
+          <w:numId w:val="1006"/>
+        </w:numPr>
+      </w:pPr>
+      <w:hyperlink w:anchor="X094464a93fe2399703fb7b75806e56105d5246e">
+        <w:r>
+          <w:rPr>
+            <w:rStyle w:val="Hyperlink"/>
+          </w:rPr>
+          <w:t xml:space="preserve">4.7.1 Clock connections</w:t>
+        </w:r>
+      </w:hyperlink>
+    </w:p>
+    <w:p>
+      <w:pPr>
+        <w:pStyle w:val="Compact"/>
+        <w:numPr>
+          <w:ilvl w:val="2"/>
+          <w:numId w:val="1006"/>
+        </w:numPr>
+      </w:pPr>
+      <w:hyperlink w:anchor="Xda0c36152236cd1660647ed1464500f75c4cb54">
+        <w:r>
+          <w:rPr>
+            <w:rStyle w:val="Hyperlink"/>
+          </w:rPr>
+          <w:t xml:space="preserve">4.7.2 Reset connections</w:t>
+        </w:r>
+      </w:hyperlink>
+    </w:p>
+    <w:p>
+      <w:pPr>
+        <w:pStyle w:val="Compact"/>
+        <w:numPr>
           <w:ilvl w:val="0"/>
           <w:numId w:val="1001"/>
         </w:numPr>
@@ -469,7 +503,7 @@
         <w:pStyle w:val="Compact"/>
         <w:numPr>
           <w:ilvl w:val="1"/>
-          <w:numId w:val="1006"/>
+          <w:numId w:val="1007"/>
         </w:numPr>
       </w:pPr>
       <w:hyperlink w:anchor="Xf652d4e185f2f67413a91e7b4dc92936f66c316">
@@ -486,7 +520,7 @@
         <w:pStyle w:val="Compact"/>
         <w:numPr>
           <w:ilvl w:val="1"/>
-          <w:numId w:val="1006"/>
+          <w:numId w:val="1007"/>
         </w:numPr>
       </w:pPr>
       <w:hyperlink w:anchor="X59dcd46a5be5290420312e376adbe926569db05">
@@ -503,7 +537,7 @@
         <w:pStyle w:val="Compact"/>
         <w:numPr>
           <w:ilvl w:val="1"/>
-          <w:numId w:val="1006"/>
+          <w:numId w:val="1007"/>
         </w:numPr>
       </w:pPr>
       <w:hyperlink w:anchor="Xa693d57e6b9ffb687c6c93de5d6eac96e9c5c01">
@@ -520,7 +554,7 @@
         <w:pStyle w:val="Compact"/>
         <w:numPr>
           <w:ilvl w:val="1"/>
-          <w:numId w:val="1006"/>
+          <w:numId w:val="1007"/>
         </w:numPr>
       </w:pPr>
       <w:hyperlink w:anchor="X508d863468794c552c1a5c2620ceb2fce25efd9">
@@ -537,7 +571,7 @@
         <w:pStyle w:val="Compact"/>
         <w:numPr>
           <w:ilvl w:val="2"/>
-          <w:numId w:val="1007"/>
+          <w:numId w:val="1008"/>
         </w:numPr>
       </w:pPr>
       <w:hyperlink w:anchor="X1aabb15feb2b5a075fa48218b55a394d1b5d400">
@@ -554,7 +588,7 @@
         <w:pStyle w:val="Compact"/>
         <w:numPr>
           <w:ilvl w:val="2"/>
-          <w:numId w:val="1007"/>
+          <w:numId w:val="1008"/>
         </w:numPr>
       </w:pPr>
       <w:hyperlink w:anchor="Xc28190accb64f82871cde223732457690162343">
@@ -571,7 +605,7 @@
         <w:pStyle w:val="Compact"/>
         <w:numPr>
           <w:ilvl w:val="2"/>
-          <w:numId w:val="1007"/>
+          <w:numId w:val="1008"/>
         </w:numPr>
       </w:pPr>
       <w:hyperlink w:anchor="X97f52ace5da799f17238d7a7ea8f854d664df56">
@@ -588,7 +622,7 @@
         <w:pStyle w:val="Compact"/>
         <w:numPr>
           <w:ilvl w:val="2"/>
-          <w:numId w:val="1007"/>
+          <w:numId w:val="1008"/>
         </w:numPr>
       </w:pPr>
       <w:hyperlink w:anchor="Xec2a7319e9bf60f6cf9392f52a65ec34a2b7ffe">
@@ -605,7 +639,7 @@
         <w:pStyle w:val="Compact"/>
         <w:numPr>
           <w:ilvl w:val="2"/>
-          <w:numId w:val="1007"/>
+          <w:numId w:val="1008"/>
         </w:numPr>
       </w:pPr>
       <w:hyperlink w:anchor="X8911d966885e7055db6f70194232771ce217e6e">
@@ -622,7 +656,7 @@
         <w:pStyle w:val="Compact"/>
         <w:numPr>
           <w:ilvl w:val="2"/>
-          <w:numId w:val="1007"/>
+          <w:numId w:val="1008"/>
         </w:numPr>
       </w:pPr>
       <w:hyperlink w:anchor="X1212e2446175f34e3da2306ad1743f87c0efafe">
@@ -639,7 +673,7 @@
         <w:pStyle w:val="Compact"/>
         <w:numPr>
           <w:ilvl w:val="2"/>
-          <w:numId w:val="1007"/>
+          <w:numId w:val="1008"/>
         </w:numPr>
       </w:pPr>
       <w:hyperlink w:anchor="X76c29bc08001edfe28c253ac77e96b63b8001d4">
@@ -656,7 +690,7 @@
         <w:pStyle w:val="Compact"/>
         <w:numPr>
           <w:ilvl w:val="2"/>
-          <w:numId w:val="1007"/>
+          <w:numId w:val="1008"/>
         </w:numPr>
       </w:pPr>
       <w:hyperlink w:anchor="X69669116aea1110529b51b1b3e7b1969ec6576d">
@@ -673,7 +707,7 @@
         <w:pStyle w:val="Compact"/>
         <w:numPr>
           <w:ilvl w:val="2"/>
-          <w:numId w:val="1007"/>
+          <w:numId w:val="1008"/>
         </w:numPr>
       </w:pPr>
       <w:hyperlink w:anchor="X5983f4e01355256eeed2232f3d5e1abfc34b666">
@@ -690,7 +724,7 @@
         <w:pStyle w:val="Compact"/>
         <w:numPr>
           <w:ilvl w:val="2"/>
-          <w:numId w:val="1007"/>
+          <w:numId w:val="1008"/>
         </w:numPr>
       </w:pPr>
       <w:hyperlink w:anchor="Xc1735d414ff8f07c3bd57fbdc5f053ed8b885e7">
@@ -707,7 +741,7 @@
         <w:pStyle w:val="Compact"/>
         <w:numPr>
           <w:ilvl w:val="2"/>
-          <w:numId w:val="1007"/>
+          <w:numId w:val="1008"/>
         </w:numPr>
       </w:pPr>
       <w:hyperlink w:anchor="Xc7c9a407099e2fa284ae49521f788bd9487ccc3">
@@ -724,7 +758,7 @@
         <w:pStyle w:val="Compact"/>
         <w:numPr>
           <w:ilvl w:val="2"/>
-          <w:numId w:val="1007"/>
+          <w:numId w:val="1008"/>
         </w:numPr>
       </w:pPr>
       <w:hyperlink w:anchor="X640648e4f38bb2ca7e0ee28f596cc191ef3b245">
@@ -741,7 +775,7 @@
         <w:pStyle w:val="Compact"/>
         <w:numPr>
           <w:ilvl w:val="2"/>
-          <w:numId w:val="1007"/>
+          <w:numId w:val="1008"/>
         </w:numPr>
       </w:pPr>
       <w:hyperlink w:anchor="Xd55da7251358860af901b08ec53e0365cc105c2">
@@ -758,7 +792,7 @@
         <w:pStyle w:val="Compact"/>
         <w:numPr>
           <w:ilvl w:val="2"/>
-          <w:numId w:val="1007"/>
+          <w:numId w:val="1008"/>
         </w:numPr>
       </w:pPr>
       <w:hyperlink w:anchor="Xf69ee5f18eb09c400b0c0dc927d0088ec8068ac">
@@ -826,7 +860,7 @@
         <w:pStyle w:val="Compact"/>
         <w:numPr>
           <w:ilvl w:val="1"/>
-          <w:numId w:val="1008"/>
+          <w:numId w:val="1009"/>
         </w:numPr>
       </w:pPr>
       <w:hyperlink w:anchor="X4367c28d3bf9bf96691c127f65c3fb2ddc71a62">
@@ -843,7 +877,7 @@
         <w:pStyle w:val="Compact"/>
         <w:numPr>
           <w:ilvl w:val="1"/>
-          <w:numId w:val="1008"/>
+          <w:numId w:val="1009"/>
         </w:numPr>
       </w:pPr>
       <w:hyperlink w:anchor="Xf04708f5572fc9964607232c1732ec67ea8282d">
@@ -860,7 +894,7 @@
         <w:pStyle w:val="Compact"/>
         <w:numPr>
           <w:ilvl w:val="1"/>
-          <w:numId w:val="1008"/>
+          <w:numId w:val="1009"/>
         </w:numPr>
       </w:pPr>
       <w:hyperlink w:anchor="X3c0d092f692fe32d59810a1bbf86f15099aa5c6">
@@ -877,7 +911,7 @@
         <w:pStyle w:val="Compact"/>
         <w:numPr>
           <w:ilvl w:val="1"/>
-          <w:numId w:val="1008"/>
+          <w:numId w:val="1009"/>
         </w:numPr>
       </w:pPr>
       <w:hyperlink w:anchor="X5657cf48bcefe145c2145dd466747d416f38959">
@@ -894,7 +928,7 @@
         <w:pStyle w:val="Compact"/>
         <w:numPr>
           <w:ilvl w:val="1"/>
-          <w:numId w:val="1008"/>
+          <w:numId w:val="1009"/>
         </w:numPr>
       </w:pPr>
       <w:hyperlink w:anchor="Xc83a3228768b310055f2548c2f7a9b5e29cb803">
@@ -911,7 +945,7 @@
         <w:pStyle w:val="Compact"/>
         <w:numPr>
           <w:ilvl w:val="1"/>
-          <w:numId w:val="1008"/>
+          <w:numId w:val="1009"/>
         </w:numPr>
       </w:pPr>
       <w:hyperlink w:anchor="X75daeb0daac82d5128b73cbf92bbd6321901b64">
@@ -928,7 +962,7 @@
         <w:pStyle w:val="Compact"/>
         <w:numPr>
           <w:ilvl w:val="1"/>
-          <w:numId w:val="1008"/>
+          <w:numId w:val="1009"/>
         </w:numPr>
       </w:pPr>
       <w:hyperlink w:anchor="Xbdeb9cc6c3538f4a8aad23dcb4226243b7d0915">
@@ -945,7 +979,7 @@
         <w:pStyle w:val="Compact"/>
         <w:numPr>
           <w:ilvl w:val="1"/>
-          <w:numId w:val="1008"/>
+          <w:numId w:val="1009"/>
         </w:numPr>
       </w:pPr>
       <w:hyperlink w:anchor="X4c7c663c791cffc72817d873b2acfd64cc0f222">
@@ -962,7 +996,7 @@
         <w:pStyle w:val="Compact"/>
         <w:numPr>
           <w:ilvl w:val="1"/>
-          <w:numId w:val="1008"/>
+          <w:numId w:val="1009"/>
         </w:numPr>
       </w:pPr>
       <w:hyperlink w:anchor="Xff3e9123ca50689e9e08955532868a42327d554">
@@ -979,7 +1013,7 @@
         <w:pStyle w:val="Compact"/>
         <w:numPr>
           <w:ilvl w:val="1"/>
-          <w:numId w:val="1008"/>
+          <w:numId w:val="1009"/>
         </w:numPr>
       </w:pPr>
       <w:hyperlink w:anchor="X0decda037ab1d094d4cccee532eef2f794c417a">
@@ -996,7 +1030,7 @@
         <w:pStyle w:val="Compact"/>
         <w:numPr>
           <w:ilvl w:val="1"/>
-          <w:numId w:val="1008"/>
+          <w:numId w:val="1009"/>
         </w:numPr>
       </w:pPr>
       <w:hyperlink w:anchor="X9dfd29372511a3468c83c24f515d5561e6d55f5">
@@ -1013,7 +1047,7 @@
         <w:pStyle w:val="Compact"/>
         <w:numPr>
           <w:ilvl w:val="1"/>
-          <w:numId w:val="1008"/>
+          <w:numId w:val="1009"/>
         </w:numPr>
       </w:pPr>
       <w:hyperlink w:anchor="X11daf15caf6e7b11010795cb3c040a236dc4f2b">
@@ -2116,6 +2150,108 @@
               <w:pStyle w:val="Compact"/>
             </w:pPr>
             <w:r>
+              <w:t xml:space="preserve">4.7.1 Clock connections</w:t>
+            </w:r>
+          </w:p>
+        </w:tc>
+        <w:tc>
+          <w:tcPr/>
+          <w:p>
+            <w:pPr>
+              <w:pStyle w:val="Compact"/>
+            </w:pPr>
+            <w:r>
+              <w:t xml:space="preserve">4.7.1</w:t>
+            </w:r>
+          </w:p>
+        </w:tc>
+        <w:tc>
+          <w:tcPr/>
+          <w:p>
+            <w:pPr>
+              <w:pStyle w:val="Compact"/>
+            </w:pPr>
+            <w:hyperlink w:anchor="X094464a93fe2399703fb7b75806e56105d5246e">
+              <w:r>
+                <w:rPr>
+                  <w:rStyle w:val="Hyperlink"/>
+                </w:rPr>
+                <w:t xml:space="preserve">Jump</w:t>
+              </w:r>
+            </w:hyperlink>
+          </w:p>
+        </w:tc>
+        <w:tc>
+          <w:tcPr/>
+          <w:p>
+            <w:pPr>
+              <w:pStyle w:val="Compact"/>
+            </w:pPr>
+            <w:r>
+              <w:t xml:space="preserve">Auto</w:t>
+            </w:r>
+          </w:p>
+        </w:tc>
+      </w:tr>
+      <w:tr>
+        <w:tc>
+          <w:tcPr/>
+          <w:p>
+            <w:pPr>
+              <w:pStyle w:val="Compact"/>
+            </w:pPr>
+            <w:r>
+              <w:t xml:space="preserve">4.7.2 Reset connections</w:t>
+            </w:r>
+          </w:p>
+        </w:tc>
+        <w:tc>
+          <w:tcPr/>
+          <w:p>
+            <w:pPr>
+              <w:pStyle w:val="Compact"/>
+            </w:pPr>
+            <w:r>
+              <w:t xml:space="preserve">4.7.2</w:t>
+            </w:r>
+          </w:p>
+        </w:tc>
+        <w:tc>
+          <w:tcPr/>
+          <w:p>
+            <w:pPr>
+              <w:pStyle w:val="Compact"/>
+            </w:pPr>
+            <w:hyperlink w:anchor="Xda0c36152236cd1660647ed1464500f75c4cb54">
+              <w:r>
+                <w:rPr>
+                  <w:rStyle w:val="Hyperlink"/>
+                </w:rPr>
+                <w:t xml:space="preserve">Jump</w:t>
+              </w:r>
+            </w:hyperlink>
+          </w:p>
+        </w:tc>
+        <w:tc>
+          <w:tcPr/>
+          <w:p>
+            <w:pPr>
+              <w:pStyle w:val="Compact"/>
+            </w:pPr>
+            <w:r>
+              <w:t xml:space="preserve">Auto</w:t>
+            </w:r>
+          </w:p>
+        </w:tc>
+      </w:tr>
+      <w:tr>
+        <w:tc>
+          <w:tcPr/>
+          <w:p>
+            <w:pPr>
+              <w:pStyle w:val="Compact"/>
+            </w:pPr>
+            <w:r>
               <w:t xml:space="preserve">5. Validation and qualification requirements</w:t>
             </w:r>
           </w:p>
@@ -4872,6 +5008,86 @@
           </w:p>
         </w:tc>
       </w:tr>
+      <w:tr>
+        <w:tc>
+          <w:tcPr/>
+          <w:p>
+            <w:pPr>
+              <w:pStyle w:val="Compact"/>
+            </w:pPr>
+            <w:r>
+              <w:t xml:space="preserve">Table 8</w:t>
+            </w:r>
+          </w:p>
+        </w:tc>
+        <w:tc>
+          <w:tcPr/>
+          <w:p>
+            <w:pPr>
+              <w:pStyle w:val="Compact"/>
+            </w:pPr>
+            <w:r>
+              <w:t xml:space="preserve">Clock connections</w:t>
+            </w:r>
+          </w:p>
+        </w:tc>
+        <w:tc>
+          <w:tcPr/>
+          <w:p>
+            <w:pPr>
+              <w:pStyle w:val="Compact"/>
+            </w:pPr>
+            <w:hyperlink w:anchor="table-8-clock-connections">
+              <w:r>
+                <w:rPr>
+                  <w:rStyle w:val="Hyperlink"/>
+                </w:rPr>
+                <w:t xml:space="preserve">Go to Table 8</w:t>
+              </w:r>
+            </w:hyperlink>
+          </w:p>
+        </w:tc>
+      </w:tr>
+      <w:tr>
+        <w:tc>
+          <w:tcPr/>
+          <w:p>
+            <w:pPr>
+              <w:pStyle w:val="Compact"/>
+            </w:pPr>
+            <w:r>
+              <w:t xml:space="preserve">Table 9</w:t>
+            </w:r>
+          </w:p>
+        </w:tc>
+        <w:tc>
+          <w:tcPr/>
+          <w:p>
+            <w:pPr>
+              <w:pStyle w:val="Compact"/>
+            </w:pPr>
+            <w:r>
+              <w:t xml:space="preserve">Reset connections</w:t>
+            </w:r>
+          </w:p>
+        </w:tc>
+        <w:tc>
+          <w:tcPr/>
+          <w:p>
+            <w:pPr>
+              <w:pStyle w:val="Compact"/>
+            </w:pPr>
+            <w:hyperlink w:anchor="table-9-reset-connections">
+              <w:r>
+                <w:rPr>
+                  <w:rStyle w:val="Hyperlink"/>
+                </w:rPr>
+                <w:t xml:space="preserve">Go to Table 9</w:t>
+              </w:r>
+            </w:hyperlink>
+          </w:p>
+        </w:tc>
+      </w:tr>
     </w:tbl>
     <w:p>
       <w:pPr>
@@ -7436,7 +7652,7 @@
     <w:bookmarkEnd w:id="65"/>
     <w:bookmarkEnd w:id="66"/>
     <w:bookmarkEnd w:id="67"/>
-    <w:bookmarkStart w:id="75" w:name="X85b60fcf2cb453d8cd4eb9036777e727a26a970"/>
+    <w:bookmarkStart w:id="79" w:name="X85b60fcf2cb453d8cd4eb9036777e727a26a970"/>
     <w:p>
       <w:pPr>
         <w:pStyle w:val="Heading2"/>
@@ -10967,7 +11183,7 @@
       </w:r>
     </w:p>
     <w:bookmarkEnd w:id="73"/>
-    <w:bookmarkStart w:id="74" w:name="Xae713b7bfda42bd4c54a5465cddf096af724b20"/>
+    <w:bookmarkStart w:id="78" w:name="Xae713b7bfda42bd4c54a5465cddf096af724b20"/>
     <w:p>
       <w:pPr>
         <w:pStyle w:val="Heading3"/>
@@ -12014,9 +12230,1127 @@
         <w:t xml:space="preserve"> </w:t>
       </w:r>
     </w:p>
+    <w:bookmarkStart w:id="75" w:name="X094464a93fe2399703fb7b75806e56105d5246e"/>
+    <w:p>
+      <w:pPr>
+        <w:pStyle w:val="Heading4"/>
+      </w:pPr>
+      <w:r>
+        <w:rPr>
+          <w:b/>
+          <w:bCs/>
+        </w:rPr>
+        <w:t xml:space="preserve">4.7.1 Clock connections</w:t>
+      </w:r>
+    </w:p>
+    <w:bookmarkStart w:id="74" w:name="table-8-clock-connections"/>
+    <w:p>
+      <w:pPr>
+        <w:pStyle w:val="Heading5"/>
+      </w:pPr>
+      <w:r>
+        <w:rPr>
+          <w:b/>
+          <w:bCs/>
+        </w:rPr>
+        <w:t xml:space="preserve">Table 8. Clock connections</w:t>
+      </w:r>
+    </w:p>
+    <w:tbl>
+      <w:tblPr>
+        <w:tblStyle w:val="Table"/>
+        <w:tblW w:type="pct" w:w="5000"/>
+        <w:tblLayout w:type="fixed"/>
+        <w:tblLook w:firstRow="1" w:lastRow="0" w:firstColumn="0" w:lastColumn="0" w:noHBand="0" w:noVBand="0" w:val="0020"/>
+        <w:tblBorders>
+          <w:top w:val="single" w:sz="4" w:space="0" w:color="000000"/>
+          <w:left w:val="single" w:sz="4" w:space="0" w:color="000000"/>
+          <w:bottom w:val="single" w:sz="4" w:space="0" w:color="000000"/>
+          <w:right w:val="single" w:sz="4" w:space="0" w:color="000000"/>
+          <w:insideH w:val="single" w:sz="4" w:space="0" w:color="000000"/>
+          <w:insideV w:val="single" w:sz="4" w:space="0" w:color="000000"/>
+        </w:tblBorders>
+      </w:tblPr>
+      <w:tblGrid>
+        <w:gridCol w:w="1584"/>
+        <w:gridCol w:w="1584"/>
+        <w:gridCol w:w="1584"/>
+        <w:gridCol w:w="1584"/>
+        <w:gridCol w:w="1584"/>
+      </w:tblGrid>
+      <w:tr>
+        <w:trPr>
+          <w:tblHeader w:val="on"/>
+        </w:trPr>
+        <w:tc>
+          <w:tcPr/>
+          <w:p>
+            <w:pPr>
+              <w:pStyle w:val="Compact"/>
+            </w:pPr>
+            <w:r>
+              <w:t xml:space="preserve">Source requirement</w:t>
+            </w:r>
+          </w:p>
+        </w:tc>
+        <w:tc>
+          <w:tcPr/>
+          <w:p>
+            <w:pPr>
+              <w:pStyle w:val="Compact"/>
+            </w:pPr>
+            <w:r>
+              <w:t xml:space="preserve">Source</w:t>
+            </w:r>
+          </w:p>
+        </w:tc>
+        <w:tc>
+          <w:tcPr/>
+          <w:p>
+            <w:pPr>
+              <w:pStyle w:val="Compact"/>
+            </w:pPr>
+            <w:r>
+              <w:t xml:space="preserve">Destination</w:t>
+            </w:r>
+          </w:p>
+        </w:tc>
+        <w:tc>
+          <w:tcPr/>
+          <w:p>
+            <w:pPr>
+              <w:pStyle w:val="Compact"/>
+            </w:pPr>
+            <w:r>
+              <w:t xml:space="preserve">Clock frequency</w:t>
+            </w:r>
+          </w:p>
+        </w:tc>
+        <w:tc>
+          <w:tcPr/>
+          <w:p>
+            <w:pPr>
+              <w:pStyle w:val="Compact"/>
+            </w:pPr>
+            <w:r>
+              <w:t xml:space="preserve">Clock gate condition</w:t>
+            </w:r>
+          </w:p>
+        </w:tc>
+      </w:tr>
+      <w:tr>
+        <w:tc>
+          <w:tcPr/>
+          <w:p>
+            <w:pPr>
+              <w:pStyle w:val="Compact"/>
+            </w:pPr>
+            <w:r>
+              <w:t xml:space="preserve">DDS_STBIO1_1024</w:t>
+            </w:r>
+          </w:p>
+        </w:tc>
+        <w:tc>
+          <w:tcPr/>
+          <w:p>
+            <w:pPr>
+              <w:pStyle w:val="Compact"/>
+            </w:pPr>
+            <w:r>
+              <w:t xml:space="preserve">stbio1_top.dig_wrapper_LV.u_pmu.clk_16m_dft</w:t>
+            </w:r>
+          </w:p>
+        </w:tc>
+        <w:tc>
+          <w:tcPr/>
+          <w:p>
+            <w:pPr>
+              <w:pStyle w:val="Compact"/>
+            </w:pPr>
+            <w:r>
+              <w:t xml:space="preserve">stbio1_top.dig_wrapper_LV.u_xbar_afe.hclk</w:t>
+            </w:r>
+          </w:p>
+        </w:tc>
+        <w:tc>
+          <w:tcPr/>
+          <w:p>
+            <w:pPr>
+              <w:pStyle w:val="Compact"/>
+            </w:pPr>
+            <w:r>
+              <w:t xml:space="preserve">16 MHz</w:t>
+            </w:r>
+          </w:p>
+        </w:tc>
+        <w:tc>
+          <w:tcPr/>
+          <w:p>
+            <w:pPr>
+              <w:pStyle w:val="Compact"/>
+            </w:pPr>
+            <w:r>
+              <w:t xml:space="preserve">stbio1_top.dig_wrapper_LV.u_pm u.clk_xbar_en | stbio1_top.dig_wrapper_LV.u_pm u.all_test_mode | ~stbio1_top.dig_wrapper_LV.u_p ad_mux.scan_enable</w:t>
+            </w:r>
+          </w:p>
+        </w:tc>
+      </w:tr>
+      <w:tr>
+        <w:tc>
+          <w:tcPr/>
+          <w:p>
+            <w:pPr>
+              <w:pStyle w:val="Compact"/>
+            </w:pPr>
+            <w:r>
+              <w:t xml:space="preserve">DDS_STBIO1_1023</w:t>
+            </w:r>
+          </w:p>
+        </w:tc>
+        <w:tc>
+          <w:tcPr/>
+          <w:p>
+            <w:pPr>
+              <w:pStyle w:val="Compact"/>
+            </w:pPr>
+            <w:r>
+              <w:t xml:space="preserve">stbio1_top.dig_wrapper_LV.u_pmu.w_sh_clk</w:t>
+            </w:r>
+          </w:p>
+        </w:tc>
+        <w:tc>
+          <w:tcPr/>
+          <w:p>
+            <w:pPr>
+              <w:pStyle w:val="Compact"/>
+            </w:pPr>
+            <w:r>
+              <w:t xml:space="preserve">stbio1_top.dig_wrapper_LV.u_masterblaze_ahb.sys_clk</w:t>
+            </w:r>
+          </w:p>
+        </w:tc>
+        <w:tc>
+          <w:tcPr/>
+          <w:p>
+            <w:pPr>
+              <w:pStyle w:val="Compact"/>
+            </w:pPr>
+            <w:r>
+              <w:t xml:space="preserve">16 MHz</w:t>
+            </w:r>
+          </w:p>
+        </w:tc>
+        <w:tc>
+          <w:tcPr/>
+          <w:p>
+            <w:pPr>
+              <w:pStyle w:val="Compact"/>
+            </w:pPr>
+            <w:r>
+              <w:t xml:space="preserve">stbio1_top.dig_wrapper_LV.u_pm u.i_en_sh_clk | stbio1_top.dig_wrapper_LV.u_pm u.all_test_mode | ~stbio1_top.dig_wrapper_LV.u_p ad_mux.scan_enable</w:t>
+            </w:r>
+          </w:p>
+        </w:tc>
+      </w:tr>
+      <w:tr>
+        <w:tc>
+          <w:tcPr/>
+          <w:p>
+            <w:pPr>
+              <w:pStyle w:val="Compact"/>
+            </w:pPr>
+            <w:r>
+              <w:t xml:space="preserve">DDS_STBIO1_2026</w:t>
+            </w:r>
+          </w:p>
+        </w:tc>
+        <w:tc>
+          <w:tcPr/>
+          <w:p>
+            <w:pPr>
+              <w:pStyle w:val="Compact"/>
+            </w:pPr>
+            <w:r>
+              <w:t xml:space="preserve">stbio1_top.dig_wrapper_LV.u_pmu.clk_xbar</w:t>
+            </w:r>
+          </w:p>
+        </w:tc>
+        <w:tc>
+          <w:tcPr/>
+          <w:p>
+            <w:pPr>
+              <w:pStyle w:val="Compact"/>
+            </w:pPr>
+            <w:r>
+              <w:t xml:space="preserve">stbio1_top.dig_wrapper_LV.u_regmap_otp.hclk</w:t>
+            </w:r>
+          </w:p>
+        </w:tc>
+        <w:tc>
+          <w:tcPr/>
+          <w:p>
+            <w:pPr>
+              <w:pStyle w:val="Compact"/>
+            </w:pPr>
+            <w:r>
+              <w:t xml:space="preserve">16 MHz</w:t>
+            </w:r>
+          </w:p>
+        </w:tc>
+        <w:tc>
+          <w:tcPr/>
+          <w:p>
+            <w:pPr>
+              <w:pStyle w:val="Compact"/>
+            </w:pPr>
+            <w:r>
+              <w:t xml:space="preserve">stbio1_top.dig_wrapper_LV.u_pm u.clk_en_m3 | stbio1_top.dig_wrapper_LV.u_pm u.all_test_mode | stbio1_top.dig_wrapper_LV.u_pm u.clk_en_m3_reg | stbio1_top.dig_wrapper_LV.u_pm u.clk_en_s3 | ~stbio1_top.dig_wrapper_LV.u_p ad_mux.scan_enable</w:t>
+            </w:r>
+          </w:p>
+        </w:tc>
+      </w:tr>
+      <w:tr>
+        <w:tc>
+          <w:tcPr/>
+          <w:p>
+            <w:pPr>
+              <w:pStyle w:val="Compact"/>
+            </w:pPr>
+            <w:r>
+              <w:t xml:space="preserve">DDS_STBIO1_1025</w:t>
+            </w:r>
+          </w:p>
+        </w:tc>
+        <w:tc>
+          <w:tcPr/>
+          <w:p>
+            <w:pPr>
+              <w:pStyle w:val="Compact"/>
+            </w:pPr>
+            <w:r>
+              <w:t xml:space="preserve">u_stbio1_top.u_pmu.u_device_startup.tst_clk_32k</w:t>
+            </w:r>
+          </w:p>
+        </w:tc>
+        <w:tc>
+          <w:tcPr/>
+          <w:p>
+            <w:pPr>
+              <w:pStyle w:val="Compact"/>
+            </w:pPr>
+            <w:r>
+              <w:t xml:space="preserve">stbio1_top.dig_wrapper_LV.tst_clk_32k</w:t>
+            </w:r>
+          </w:p>
+        </w:tc>
+        <w:tc>
+          <w:tcPr/>
+          <w:p>
+            <w:pPr>
+              <w:pStyle w:val="Compact"/>
+            </w:pPr>
+            <w:r>
+              <w:t xml:space="preserve">32 kHz</w:t>
+            </w:r>
+          </w:p>
+        </w:tc>
+        <w:tc>
+          <w:tcPr/>
+          <w:p>
+            <w:pPr>
+              <w:pStyle w:val="Compact"/>
+            </w:pPr>
+            <w:r>
+              <w:t xml:space="preserve">Not gated</w:t>
+            </w:r>
+          </w:p>
+        </w:tc>
+      </w:tr>
+      <w:tr>
+        <w:tc>
+          <w:tcPr/>
+          <w:p>
+            <w:pPr>
+              <w:pStyle w:val="Compact"/>
+            </w:pPr>
+            <w:r>
+              <w:t xml:space="preserve">DDS_STBIO1_1022</w:t>
+            </w:r>
+          </w:p>
+        </w:tc>
+        <w:tc>
+          <w:tcPr/>
+          <w:p>
+            <w:pPr>
+              <w:pStyle w:val="Compact"/>
+            </w:pPr>
+            <w:r>
+              <w:t xml:space="preserve">stbio1_top.dig_wrapper_LV.u_pmu.clk_16m_dft</w:t>
+            </w:r>
+          </w:p>
+        </w:tc>
+        <w:tc>
+          <w:tcPr/>
+          <w:p>
+            <w:pPr>
+              <w:pStyle w:val="Compact"/>
+            </w:pPr>
+            <w:r>
+              <w:t xml:space="preserve">stbio1_top.dig_wrapper_LV.u_ADSP.stmc_clk</w:t>
+            </w:r>
+          </w:p>
+        </w:tc>
+        <w:tc>
+          <w:tcPr/>
+          <w:p>
+            <w:pPr>
+              <w:pStyle w:val="Compact"/>
+            </w:pPr>
+            <w:r>
+              <w:t xml:space="preserve">16 MHz</w:t>
+            </w:r>
+          </w:p>
+        </w:tc>
+        <w:tc>
+          <w:tcPr/>
+          <w:p>
+            <w:pPr>
+              <w:pStyle w:val="Compact"/>
+            </w:pPr>
+            <w:r>
+              <w:t xml:space="preserve">stbio1_top.dig_wrapper_LV.u_pm u.adsp_run | stbio1_top.dig_wrapper_LV.u_pm u.all_test_mode | ~stbio1_top.dig_wrapper_LV.u_p ad_mux.scan_enable</w:t>
+            </w:r>
+          </w:p>
+        </w:tc>
+      </w:tr>
+      <w:tr>
+        <w:tc>
+          <w:tcPr/>
+          <w:p>
+            <w:pPr>
+              <w:pStyle w:val="Compact"/>
+            </w:pPr>
+            <w:r>
+              <w:t xml:space="preserve">DDS_STBIO1_2024</w:t>
+            </w:r>
+          </w:p>
+        </w:tc>
+        <w:tc>
+          <w:tcPr/>
+          <w:p>
+            <w:pPr>
+              <w:pStyle w:val="Compact"/>
+            </w:pPr>
+            <w:r>
+              <w:t xml:space="preserve">stbio1_top.dig_wrapper_LV.u_pmuclk_xbar</w:t>
+            </w:r>
+          </w:p>
+        </w:tc>
+        <w:tc>
+          <w:tcPr/>
+          <w:p>
+            <w:pPr>
+              <w:pStyle w:val="Compact"/>
+            </w:pPr>
+            <w:r>
+              <w:t xml:space="preserve">stbio1_top.dig_wrapper_LV.u.fifo.HCLK</w:t>
+            </w:r>
+          </w:p>
+        </w:tc>
+        <w:tc>
+          <w:tcPr/>
+          <w:p>
+            <w:pPr>
+              <w:pStyle w:val="Compact"/>
+            </w:pPr>
+            <w:r>
+              <w:t xml:space="preserve">16 MHz</w:t>
+            </w:r>
+          </w:p>
+        </w:tc>
+        <w:tc>
+          <w:tcPr/>
+          <w:p>
+            <w:pPr>
+              <w:pStyle w:val="Compact"/>
+            </w:pPr>
+            <w:r>
+              <w:t xml:space="preserve">stbio1_top.dig_wrapper_LV.u_pm u.clk_en_m2 | stbio1_top.dig_wrapper_LV.u_pm u.all_test_mode | stbio1_top.dig_wrapper_LV.u_pm u.clk_en_m2_reg | ~stbio1_top.dig_wrapper_LV.u_p ad_mux.scan_enable</w:t>
+            </w:r>
+          </w:p>
+        </w:tc>
+      </w:tr>
+      <w:tr>
+        <w:tc>
+          <w:tcPr/>
+          <w:p>
+            <w:pPr>
+              <w:pStyle w:val="Compact"/>
+            </w:pPr>
+            <w:r>
+              <w:t xml:space="preserve">DDS_STBIO1_2025</w:t>
+            </w:r>
+          </w:p>
+        </w:tc>
+        <w:tc>
+          <w:tcPr/>
+          <w:p>
+            <w:pPr>
+              <w:pStyle w:val="Compact"/>
+            </w:pPr>
+            <w:r>
+              <w:t xml:space="preserve">stbio1_top.dig_wrapper_LV.u_pmu.clk_stredl</w:t>
+            </w:r>
+          </w:p>
+        </w:tc>
+        <w:tc>
+          <w:tcPr/>
+          <w:p>
+            <w:pPr>
+              <w:pStyle w:val="Compact"/>
+            </w:pPr>
+            <w:r>
+              <w:t xml:space="preserve">stbio1_top.dig_wrapper_LV.u_ispu.clk</w:t>
+            </w:r>
+          </w:p>
+        </w:tc>
+        <w:tc>
+          <w:tcPr/>
+          <w:p>
+            <w:pPr>
+              <w:pStyle w:val="Compact"/>
+            </w:pPr>
+            <w:r>
+              <w:t xml:space="preserve">16 MHz</w:t>
+            </w:r>
+          </w:p>
+        </w:tc>
+        <w:tc>
+          <w:tcPr/>
+          <w:p>
+            <w:pPr>
+              <w:pStyle w:val="Compact"/>
+            </w:pPr>
+            <w:r>
+              <w:t xml:space="preserve">Not gated</w:t>
+            </w:r>
+          </w:p>
+        </w:tc>
+      </w:tr>
+      <w:tr>
+        <w:tc>
+          <w:tcPr/>
+          <w:p>
+            <w:pPr>
+              <w:pStyle w:val="Compact"/>
+            </w:pPr>
+            <w:r>
+              <w:t xml:space="preserve">DDS_STBIO1_1021</w:t>
+            </w:r>
+          </w:p>
+        </w:tc>
+        <w:tc>
+          <w:tcPr/>
+          <w:p>
+            <w:pPr>
+              <w:pStyle w:val="Compact"/>
+            </w:pPr>
+            <w:r>
+              <w:t xml:space="preserve">stbio1_top.clk_64k</w:t>
+            </w:r>
+          </w:p>
+        </w:tc>
+        <w:tc>
+          <w:tcPr/>
+          <w:p>
+            <w:pPr>
+              <w:pStyle w:val="Compact"/>
+            </w:pPr>
+            <w:r>
+              <w:t xml:space="preserve">stbio1_top.dig_wrapper_LV.u_pmu.clk_64k</w:t>
+            </w:r>
+          </w:p>
+        </w:tc>
+        <w:tc>
+          <w:tcPr/>
+          <w:p>
+            <w:pPr>
+              <w:pStyle w:val="Compact"/>
+            </w:pPr>
+            <w:r>
+              <w:t xml:space="preserve">64 kHz</w:t>
+            </w:r>
+          </w:p>
+        </w:tc>
+        <w:tc>
+          <w:tcPr/>
+          <w:p>
+            <w:pPr>
+              <w:pStyle w:val="Compact"/>
+            </w:pPr>
+            <w:r>
+              <w:t xml:space="preserve">Not gated</w:t>
+            </w:r>
+          </w:p>
+        </w:tc>
+      </w:tr>
+      <w:tr>
+        <w:tc>
+          <w:tcPr/>
+          <w:p>
+            <w:pPr>
+              <w:pStyle w:val="Compact"/>
+            </w:pPr>
+            <w:r>
+              <w:t xml:space="preserve">DDS_STBIO1_1026</w:t>
+            </w:r>
+          </w:p>
+        </w:tc>
+        <w:tc>
+          <w:tcPr/>
+          <w:p>
+            <w:pPr>
+              <w:pStyle w:val="Compact"/>
+            </w:pPr>
+            <w:r>
+              <w:t xml:space="preserve">stbio1_top.dig_wrapper_LV.u_pmu.tst_clk_16m</w:t>
+            </w:r>
+          </w:p>
+        </w:tc>
+        <w:tc>
+          <w:tcPr/>
+          <w:p>
+            <w:pPr>
+              <w:pStyle w:val="Compact"/>
+            </w:pPr>
+            <w:r>
+              <w:t xml:space="preserve">stbio1_top.dig_wrapper_LV.u_main_controller_top.i_clk_16MHz</w:t>
+            </w:r>
+          </w:p>
+        </w:tc>
+        <w:tc>
+          <w:tcPr/>
+          <w:p>
+            <w:pPr>
+              <w:pStyle w:val="Compact"/>
+            </w:pPr>
+            <w:r>
+              <w:t xml:space="preserve">16 MHz</w:t>
+            </w:r>
+          </w:p>
+        </w:tc>
+        <w:tc>
+          <w:tcPr/>
+          <w:p>
+            <w:pPr>
+              <w:pStyle w:val="Compact"/>
+            </w:pPr>
+            <w:r>
+              <w:t xml:space="preserve">stbio1_top.dig_wrapper_LV.u_pm u.i_en_clk_16MHz_sleep | stbio1_top.dig_wrapper_LV.u_pm u.scan_mode | ~stbio1_top.dig_wrapper_LV.u_p ad_mux.scan_enable</w:t>
+            </w:r>
+          </w:p>
+        </w:tc>
+      </w:tr>
+      <w:tr>
+        <w:tc>
+          <w:tcPr/>
+          <w:p>
+            <w:pPr>
+              <w:pStyle w:val="Compact"/>
+            </w:pPr>
+            <w:r>
+              <w:t xml:space="preserve">DDS_STBIO1_1027</w:t>
+            </w:r>
+          </w:p>
+        </w:tc>
+        <w:tc>
+          <w:tcPr/>
+          <w:p>
+            <w:pPr>
+              <w:pStyle w:val="Compact"/>
+            </w:pPr>
+            <w:r>
+              <w:t xml:space="preserve">stbio1_top.dig_wrapper_LV.u_pmu.tst_clk_32k</w:t>
+            </w:r>
+          </w:p>
+        </w:tc>
+        <w:tc>
+          <w:tcPr/>
+          <w:p>
+            <w:pPr>
+              <w:pStyle w:val="Compact"/>
+            </w:pPr>
+            <w:r>
+              <w:t xml:space="preserve">stbio1_top.dig_wrapper_LV.u_main_controller_top.i_clk_32kHz</w:t>
+            </w:r>
+          </w:p>
+        </w:tc>
+        <w:tc>
+          <w:tcPr/>
+          <w:p>
+            <w:pPr>
+              <w:pStyle w:val="Compact"/>
+            </w:pPr>
+            <w:r>
+              <w:t xml:space="preserve">32 kHz</w:t>
+            </w:r>
+          </w:p>
+        </w:tc>
+        <w:tc>
+          <w:tcPr/>
+          <w:p>
+            <w:pPr>
+              <w:pStyle w:val="Compact"/>
+            </w:pPr>
+            <w:r>
+              <w:t xml:space="preserve">Not gated</w:t>
+            </w:r>
+          </w:p>
+        </w:tc>
+      </w:tr>
+      <w:tr>
+        <w:tc>
+          <w:tcPr/>
+          <w:p>
+            <w:pPr>
+              <w:pStyle w:val="Compact"/>
+            </w:pPr>
+            <w:r>
+              <w:t xml:space="preserve">DDS_STBIO1_1020</w:t>
+            </w:r>
+          </w:p>
+        </w:tc>
+        <w:tc>
+          <w:tcPr/>
+          <w:p>
+            <w:pPr>
+              <w:pStyle w:val="Compact"/>
+            </w:pPr>
+            <w:r>
+              <w:t xml:space="preserve">stbio1_top.clk_16m</w:t>
+            </w:r>
+          </w:p>
+        </w:tc>
+        <w:tc>
+          <w:tcPr/>
+          <w:p>
+            <w:pPr>
+              <w:pStyle w:val="Compact"/>
+            </w:pPr>
+            <w:r>
+              <w:t xml:space="preserve">stbio1_top.dig_wrapper_LV.u_pmu.clk_16m</w:t>
+            </w:r>
+          </w:p>
+        </w:tc>
+        <w:tc>
+          <w:tcPr/>
+          <w:p>
+            <w:pPr>
+              <w:pStyle w:val="Compact"/>
+            </w:pPr>
+            <w:r>
+              <w:t xml:space="preserve">16 MHz</w:t>
+            </w:r>
+          </w:p>
+        </w:tc>
+        <w:tc>
+          <w:tcPr/>
+          <w:p>
+            <w:pPr>
+              <w:pStyle w:val="Compact"/>
+            </w:pPr>
+            <w:r>
+              <w:t xml:space="preserve">Not gated</w:t>
+            </w:r>
+          </w:p>
+        </w:tc>
+      </w:tr>
+    </w:tbl>
+    <w:p>
+      <w:pPr>
+        <w:pStyle w:val="BodyText"/>
+      </w:pPr>
+      <w:r>
+        <w:t xml:space="preserve"> </w:t>
+      </w:r>
+    </w:p>
     <w:bookmarkEnd w:id="74"/>
     <w:bookmarkEnd w:id="75"/>
-    <w:bookmarkStart w:id="76" w:name="Xc26db79f3514a016dff58de0917d7f6d8e81fab"/>
+    <w:bookmarkStart w:id="77" w:name="Xda0c36152236cd1660647ed1464500f75c4cb54"/>
+    <w:p>
+      <w:pPr>
+        <w:pStyle w:val="Heading4"/>
+      </w:pPr>
+      <w:r>
+        <w:rPr>
+          <w:b/>
+          <w:bCs/>
+        </w:rPr>
+        <w:t xml:space="preserve">4.7.2 Reset connections</w:t>
+      </w:r>
+    </w:p>
+    <w:bookmarkStart w:id="76" w:name="table-9-reset-connections"/>
+    <w:p>
+      <w:pPr>
+        <w:pStyle w:val="Heading5"/>
+      </w:pPr>
+      <w:r>
+        <w:rPr>
+          <w:b/>
+          <w:bCs/>
+        </w:rPr>
+        <w:t xml:space="preserve">Table 9. Reset connections</w:t>
+      </w:r>
+    </w:p>
+    <w:tbl>
+      <w:tblPr>
+        <w:tblStyle w:val="Table"/>
+        <w:tblW w:type="pct" w:w="5000"/>
+        <w:tblLayout w:type="fixed"/>
+        <w:tblLook w:firstRow="1" w:lastRow="0" w:firstColumn="0" w:lastColumn="0" w:noHBand="0" w:noVBand="0" w:val="0020"/>
+        <w:tblBorders>
+          <w:top w:val="single" w:sz="4" w:space="0" w:color="000000"/>
+          <w:left w:val="single" w:sz="4" w:space="0" w:color="000000"/>
+          <w:bottom w:val="single" w:sz="4" w:space="0" w:color="000000"/>
+          <w:right w:val="single" w:sz="4" w:space="0" w:color="000000"/>
+          <w:insideH w:val="single" w:sz="4" w:space="0" w:color="000000"/>
+          <w:insideV w:val="single" w:sz="4" w:space="0" w:color="000000"/>
+        </w:tblBorders>
+      </w:tblPr>
+      <w:tblGrid>
+        <w:gridCol w:w="2640"/>
+        <w:gridCol w:w="2640"/>
+        <w:gridCol w:w="2640"/>
+      </w:tblGrid>
+      <w:tr>
+        <w:trPr>
+          <w:tblHeader w:val="on"/>
+        </w:trPr>
+        <w:tc>
+          <w:tcPr/>
+          <w:p>
+            <w:pPr>
+              <w:pStyle w:val="Compact"/>
+            </w:pPr>
+            <w:r>
+              <w:t xml:space="preserve">Source requirement</w:t>
+            </w:r>
+          </w:p>
+        </w:tc>
+        <w:tc>
+          <w:tcPr/>
+          <w:p>
+            <w:pPr>
+              <w:pStyle w:val="Compact"/>
+            </w:pPr>
+            <w:r>
+              <w:t xml:space="preserve">Source</w:t>
+            </w:r>
+          </w:p>
+        </w:tc>
+        <w:tc>
+          <w:tcPr/>
+          <w:p>
+            <w:pPr>
+              <w:pStyle w:val="Compact"/>
+            </w:pPr>
+            <w:r>
+              <w:t xml:space="preserve">Destination</w:t>
+            </w:r>
+          </w:p>
+        </w:tc>
+      </w:tr>
+      <w:tr>
+        <w:tc>
+          <w:tcPr/>
+          <w:p>
+            <w:pPr>
+              <w:pStyle w:val="Compact"/>
+            </w:pPr>
+            <w:r>
+              <w:t xml:space="preserve">DDS_STBIO1_2054</w:t>
+            </w:r>
+          </w:p>
+        </w:tc>
+        <w:tc>
+          <w:tcPr/>
+          <w:p>
+            <w:pPr>
+              <w:pStyle w:val="Compact"/>
+            </w:pPr>
+            <w:r>
+              <w:t xml:space="preserve">u_stbio1_top.dig_wrapper_LV.u_p</w:t>
+            </w:r>
+          </w:p>
+        </w:tc>
+        <w:tc>
+          <w:tcPr/>
+          <w:p>
+            <w:pPr>
+              <w:pStyle w:val="Compact"/>
+            </w:pPr>
+            <w:r>
+              <w:t xml:space="preserve">mu.resetn_32k_main_ctrlu_stbio1_top.dig_wrapper_LV.u_main_controller_top.i_rstn_sync_32</w:t>
+            </w:r>
+          </w:p>
+        </w:tc>
+      </w:tr>
+      <w:tr>
+        <w:tc>
+          <w:tcPr/>
+          <w:p>
+            <w:pPr>
+              <w:pStyle w:val="Compact"/>
+            </w:pPr>
+            <w:r>
+              <w:t xml:space="preserve">DDS_STBIO1_2052</w:t>
+            </w:r>
+          </w:p>
+        </w:tc>
+        <w:tc>
+          <w:tcPr/>
+          <w:p>
+            <w:pPr>
+              <w:pStyle w:val="Compact"/>
+            </w:pPr>
+          </w:p>
+        </w:tc>
+        <w:tc>
+          <w:tcPr/>
+          <w:p>
+            <w:pPr>
+              <w:pStyle w:val="Compact"/>
+            </w:pPr>
+            <w:r>
+              <w:t xml:space="preserve">u_device_startup.u_por_main_resetn.RST_N_FF[0]u_stbio1_top.dig_wrapper_LV.u_xbar_afe.hresetn</w:t>
+            </w:r>
+          </w:p>
+        </w:tc>
+      </w:tr>
+      <w:tr>
+        <w:tc>
+          <w:tcPr/>
+          <w:p>
+            <w:pPr>
+              <w:pStyle w:val="Compact"/>
+            </w:pPr>
+            <w:r>
+              <w:t xml:space="preserve">DDS_STBIO1_1053</w:t>
+            </w:r>
+          </w:p>
+        </w:tc>
+        <w:tc>
+          <w:tcPr/>
+          <w:p>
+            <w:pPr>
+              <w:pStyle w:val="Compact"/>
+            </w:pPr>
+            <w:r>
+              <w:t xml:space="preserve">u_stbio1_top.dig_wrapper_LV.u_p</w:t>
+            </w:r>
+          </w:p>
+        </w:tc>
+        <w:tc>
+          <w:tcPr/>
+          <w:p>
+            <w:pPr>
+              <w:pStyle w:val="Compact"/>
+            </w:pPr>
+            <w:r>
+              <w:t xml:space="preserve">mu.resetn_fifou_stbio1_top.dig_wrapper_LV.u_multi_channel_fifo_top.HRESETn</w:t>
+            </w:r>
+          </w:p>
+        </w:tc>
+      </w:tr>
+      <w:tr>
+        <w:tc>
+          <w:tcPr/>
+          <w:p>
+            <w:pPr>
+              <w:pStyle w:val="Compact"/>
+            </w:pPr>
+            <w:r>
+              <w:t xml:space="preserve">DDS_STBIO1_1052</w:t>
+            </w:r>
+          </w:p>
+        </w:tc>
+        <w:tc>
+          <w:tcPr/>
+          <w:p>
+            <w:pPr>
+              <w:pStyle w:val="Compact"/>
+            </w:pPr>
+            <w:r>
+              <w:t xml:space="preserve">u_stbio1_top.dig_wrapper_LV.u_p</w:t>
+            </w:r>
+          </w:p>
+        </w:tc>
+        <w:tc>
+          <w:tcPr/>
+          <w:p>
+            <w:pPr>
+              <w:pStyle w:val="Compact"/>
+            </w:pPr>
+            <w:r>
+              <w:t xml:space="preserve">mu.resetn_regmapu_stbio1_top.dig_wrapper_LV.u_regmap_otp.hresetn</w:t>
+            </w:r>
+          </w:p>
+        </w:tc>
+      </w:tr>
+      <w:tr>
+        <w:tc>
+          <w:tcPr/>
+          <w:p>
+            <w:pPr>
+              <w:pStyle w:val="Compact"/>
+            </w:pPr>
+            <w:r>
+              <w:t xml:space="preserve">DDS_STBIO1_1050</w:t>
+            </w:r>
+          </w:p>
+        </w:tc>
+        <w:tc>
+          <w:tcPr/>
+          <w:p>
+            <w:pPr>
+              <w:pStyle w:val="Compact"/>
+            </w:pPr>
+            <w:r>
+              <w:t xml:space="preserve">u_stbio1_top.dig_wrapper_LV.u_p</w:t>
+            </w:r>
+          </w:p>
+        </w:tc>
+        <w:tc>
+          <w:tcPr/>
+          <w:p>
+            <w:pPr>
+              <w:pStyle w:val="Compact"/>
+            </w:pPr>
+            <w:r>
+              <w:t xml:space="preserve">mu.resetn_stmcu_stbio1_top.dig_wrapper_LV.u_ADSP.HRESETn</w:t>
+            </w:r>
+          </w:p>
+        </w:tc>
+      </w:tr>
+      <w:tr>
+        <w:tc>
+          <w:tcPr/>
+          <w:p>
+            <w:pPr>
+              <w:pStyle w:val="Compact"/>
+            </w:pPr>
+            <w:r>
+              <w:t xml:space="preserve">DDS_STBIO1_1051</w:t>
+            </w:r>
+          </w:p>
+        </w:tc>
+        <w:tc>
+          <w:tcPr/>
+          <w:p>
+            <w:pPr>
+              <w:pStyle w:val="Compact"/>
+            </w:pPr>
+            <w:r>
+              <w:t xml:space="preserve">u_stbio1_top.dig_wrapper_LV.u_p</w:t>
+            </w:r>
+          </w:p>
+        </w:tc>
+        <w:tc>
+          <w:tcPr/>
+          <w:p>
+            <w:pPr>
+              <w:pStyle w:val="Compact"/>
+            </w:pPr>
+            <w:r>
+              <w:t xml:space="preserve">mu.resetn_masterblazeu_stbio1_top.dig_wrapper_LV.u_masterblaze_ahb.HRESETn</w:t>
+            </w:r>
+          </w:p>
+        </w:tc>
+      </w:tr>
+      <w:tr>
+        <w:tc>
+          <w:tcPr/>
+          <w:p>
+            <w:pPr>
+              <w:pStyle w:val="Compact"/>
+            </w:pPr>
+            <w:r>
+              <w:t xml:space="preserve">DDS_STBIO1_1054</w:t>
+            </w:r>
+          </w:p>
+        </w:tc>
+        <w:tc>
+          <w:tcPr/>
+          <w:p>
+            <w:pPr>
+              <w:pStyle w:val="Compact"/>
+            </w:pPr>
+            <w:r>
+              <w:t xml:space="preserve">u_stbio1_top.dig_wrapper_LV.u_p</w:t>
+            </w:r>
+          </w:p>
+        </w:tc>
+        <w:tc>
+          <w:tcPr/>
+          <w:p>
+            <w:pPr>
+              <w:pStyle w:val="Compact"/>
+            </w:pPr>
+            <w:r>
+              <w:t xml:space="preserve">mu.resetn_main_ctrlu_stbio1_top.dig_wrapper_LV.u_main_controller_top.i_rstn</w:t>
+            </w:r>
+          </w:p>
+        </w:tc>
+      </w:tr>
+      <w:tr>
+        <w:tc>
+          <w:tcPr/>
+          <w:p>
+            <w:pPr>
+              <w:pStyle w:val="Compact"/>
+            </w:pPr>
+            <w:r>
+              <w:t xml:space="preserve">DDS_STBIO1_2053</w:t>
+            </w:r>
+          </w:p>
+        </w:tc>
+        <w:tc>
+          <w:tcPr/>
+          <w:p>
+            <w:pPr>
+              <w:pStyle w:val="Compact"/>
+            </w:pPr>
+            <w:r>
+              <w:t xml:space="preserve">u_stbio1_top.dig_wrapper_LV.u_p</w:t>
+            </w:r>
+          </w:p>
+        </w:tc>
+        <w:tc>
+          <w:tcPr/>
+          <w:p>
+            <w:pPr>
+              <w:pStyle w:val="Compact"/>
+            </w:pPr>
+            <w:r>
+              <w:t xml:space="preserve">mu.resetn_regmapu_stbio1_top.dig_wrapper_LV.u_ispu.main_rst_n</w:t>
+            </w:r>
+          </w:p>
+        </w:tc>
+      </w:tr>
+    </w:tbl>
+    <w:p>
+      <w:pPr>
+        <w:pStyle w:val="BodyText"/>
+      </w:pPr>
+      <w:r>
+        <w:t xml:space="preserve"> </w:t>
+      </w:r>
+    </w:p>
+    <w:bookmarkEnd w:id="76"/>
+    <w:bookmarkEnd w:id="77"/>
+    <w:bookmarkEnd w:id="78"/>
+    <w:bookmarkEnd w:id="79"/>
+    <w:bookmarkStart w:id="80" w:name="Xc26db79f3514a016dff58de0917d7f6d8e81fab"/>
     <w:p>
       <w:pPr>
         <w:pStyle w:val="Heading2"/>
@@ -12034,15 +13368,15 @@
         <w:pStyle w:val="Compact"/>
         <w:numPr>
           <w:ilvl w:val="0"/>
-          <w:numId w:val="1009"/>
+          <w:numId w:val="1010"/>
         </w:numPr>
       </w:pPr>
       <w:r>
         <w:t xml:space="preserve">Verification shall combine inspection, analysis, and test with measurable acceptance criteria.</w:t>
       </w:r>
     </w:p>
-    <w:bookmarkEnd w:id="76"/>
-    <w:bookmarkStart w:id="98" w:name="X045f6730a5caea101ea480f71820b59e27ae49d"/>
+    <w:bookmarkEnd w:id="80"/>
+    <w:bookmarkStart w:id="102" w:name="X045f6730a5caea101ea480f71820b59e27ae49d"/>
     <w:p>
       <w:pPr>
         <w:pStyle w:val="Heading2"/>
@@ -12055,7 +13389,7 @@
         <w:t xml:space="preserve">6. Requirement identification and traceability</w:t>
       </w:r>
     </w:p>
-    <w:bookmarkStart w:id="77" w:name="Xf652d4e185f2f67413a91e7b4dc92936f66c316"/>
+    <w:bookmarkStart w:id="81" w:name="Xf652d4e185f2f67413a91e7b4dc92936f66c316"/>
     <w:p>
       <w:pPr>
         <w:pStyle w:val="Heading3"/>
@@ -12084,8 +13418,8 @@
         <w:t xml:space="preserve"> </w:t>
       </w:r>
     </w:p>
-    <w:bookmarkEnd w:id="77"/>
-    <w:bookmarkStart w:id="78" w:name="X59dcd46a5be5290420312e376adbe926569db05"/>
+    <w:bookmarkEnd w:id="81"/>
+    <w:bookmarkStart w:id="82" w:name="X59dcd46a5be5290420312e376adbe926569db05"/>
     <w:p>
       <w:pPr>
         <w:pStyle w:val="Heading3"/>
@@ -12114,8 +13448,8 @@
         <w:t xml:space="preserve"> </w:t>
       </w:r>
     </w:p>
-    <w:bookmarkEnd w:id="78"/>
-    <w:bookmarkStart w:id="82" w:name="Xa693d57e6b9ffb687c6c93de5d6eac96e9c5c01"/>
+    <w:bookmarkEnd w:id="82"/>
+    <w:bookmarkStart w:id="86" w:name="Xa693d57e6b9ffb687c6c93de5d6eac96e9c5c01"/>
     <w:p>
       <w:pPr>
         <w:pStyle w:val="Heading3"/>
@@ -12128,7 +13462,7 @@
         <w:t xml:space="preserve">6.3 Requirement catalog</w:t>
       </w:r>
     </w:p>
-    <w:bookmarkStart w:id="79" w:name="digital-requirements"/>
+    <w:bookmarkStart w:id="83" w:name="digital-requirements"/>
     <w:p>
       <w:pPr>
         <w:pStyle w:val="Heading4"/>
@@ -12146,15 +13480,15 @@
         <w:pStyle w:val="Compact"/>
         <w:numPr>
           <w:ilvl w:val="0"/>
-          <w:numId w:val="1010"/>
+          <w:numId w:val="1011"/>
         </w:numPr>
       </w:pPr>
       <w:r>
         <w:t xml:space="preserve">No residual unmapped requirements for this domain (mapped items are captured in project-specific sub-block requirement paragraphs).</w:t>
       </w:r>
     </w:p>
-    <w:bookmarkEnd w:id="79"/>
-    <w:bookmarkStart w:id="80" w:name="cross-domain-requirements"/>
+    <w:bookmarkEnd w:id="83"/>
+    <w:bookmarkStart w:id="84" w:name="cross-domain-requirements"/>
     <w:p>
       <w:pPr>
         <w:pStyle w:val="Heading4"/>
@@ -12172,15 +13506,15 @@
         <w:pStyle w:val="Compact"/>
         <w:numPr>
           <w:ilvl w:val="0"/>
-          <w:numId w:val="1011"/>
+          <w:numId w:val="1012"/>
         </w:numPr>
       </w:pPr>
       <w:r>
         <w:t xml:space="preserve">No residual unmapped requirements for this domain (mapped items are captured in project-specific sub-block requirement paragraphs).</w:t>
       </w:r>
     </w:p>
-    <w:bookmarkEnd w:id="80"/>
-    <w:bookmarkStart w:id="81" w:name="use-case-user-specific"/>
+    <w:bookmarkEnd w:id="84"/>
+    <w:bookmarkStart w:id="85" w:name="use-case-user-specific"/>
     <w:p>
       <w:pPr>
         <w:pStyle w:val="Heading4"/>
@@ -12198,16 +13532,16 @@
         <w:pStyle w:val="Compact"/>
         <w:numPr>
           <w:ilvl w:val="0"/>
-          <w:numId w:val="1012"/>
+          <w:numId w:val="1013"/>
         </w:numPr>
       </w:pPr>
       <w:r>
         <w:t xml:space="preserve">None</w:t>
       </w:r>
     </w:p>
-    <w:bookmarkEnd w:id="81"/>
-    <w:bookmarkEnd w:id="82"/>
-    <w:bookmarkStart w:id="97" w:name="X508d863468794c552c1a5c2620ceb2fce25efd9"/>
+    <w:bookmarkEnd w:id="85"/>
+    <w:bookmarkEnd w:id="86"/>
+    <w:bookmarkStart w:id="101" w:name="X508d863468794c552c1a5c2620ceb2fce25efd9"/>
     <w:p>
       <w:pPr>
         <w:pStyle w:val="Heading3"/>
@@ -12220,7 +13554,7 @@
         <w:t xml:space="preserve">6.4 Source Function Context</w:t>
       </w:r>
     </w:p>
-    <w:bookmarkStart w:id="83" w:name="X1aabb15feb2b5a075fa48218b55a394d1b5d400"/>
+    <w:bookmarkStart w:id="87" w:name="X1aabb15feb2b5a075fa48218b55a394d1b5d400"/>
     <w:p>
       <w:pPr>
         <w:pStyle w:val="Heading4"/>
@@ -12267,7 +13601,7 @@
         <w:pStyle w:val="Compact"/>
         <w:numPr>
           <w:ilvl w:val="0"/>
-          <w:numId w:val="1013"/>
+          <w:numId w:val="1014"/>
         </w:numPr>
       </w:pPr>
       <w:r>
@@ -12279,7 +13613,7 @@
         <w:pStyle w:val="Compact"/>
         <w:numPr>
           <w:ilvl w:val="0"/>
-          <w:numId w:val="1013"/>
+          <w:numId w:val="1014"/>
         </w:numPr>
       </w:pPr>
       <w:r>
@@ -12291,7 +13625,7 @@
         <w:pStyle w:val="Compact"/>
         <w:numPr>
           <w:ilvl w:val="0"/>
-          <w:numId w:val="1013"/>
+          <w:numId w:val="1014"/>
         </w:numPr>
       </w:pPr>
       <w:r>
@@ -12303,7 +13637,7 @@
         <w:pStyle w:val="Compact"/>
         <w:numPr>
           <w:ilvl w:val="0"/>
-          <w:numId w:val="1013"/>
+          <w:numId w:val="1014"/>
         </w:numPr>
       </w:pPr>
       <w:r>
@@ -12315,7 +13649,7 @@
         <w:pStyle w:val="Compact"/>
         <w:numPr>
           <w:ilvl w:val="0"/>
-          <w:numId w:val="1013"/>
+          <w:numId w:val="1014"/>
         </w:numPr>
       </w:pPr>
       <w:r>
@@ -12327,7 +13661,7 @@
         <w:pStyle w:val="Compact"/>
         <w:numPr>
           <w:ilvl w:val="0"/>
-          <w:numId w:val="1013"/>
+          <w:numId w:val="1014"/>
         </w:numPr>
       </w:pPr>
       <w:r>
@@ -12339,7 +13673,7 @@
         <w:pStyle w:val="Compact"/>
         <w:numPr>
           <w:ilvl w:val="0"/>
-          <w:numId w:val="1013"/>
+          <w:numId w:val="1014"/>
         </w:numPr>
       </w:pPr>
       <w:r>
@@ -12351,7 +13685,7 @@
         <w:pStyle w:val="Compact"/>
         <w:numPr>
           <w:ilvl w:val="0"/>
-          <w:numId w:val="1013"/>
+          <w:numId w:val="1014"/>
         </w:numPr>
       </w:pPr>
       <w:r>
@@ -12390,8 +13724,8 @@
         <w:t xml:space="preserve"> </w:t>
       </w:r>
     </w:p>
-    <w:bookmarkEnd w:id="83"/>
-    <w:bookmarkStart w:id="84" w:name="Xc28190accb64f82871cde223732457690162343"/>
+    <w:bookmarkEnd w:id="87"/>
+    <w:bookmarkStart w:id="88" w:name="Xc28190accb64f82871cde223732457690162343"/>
     <w:p>
       <w:pPr>
         <w:pStyle w:val="Heading4"/>
@@ -12438,7 +13772,7 @@
         <w:pStyle w:val="Compact"/>
         <w:numPr>
           <w:ilvl w:val="0"/>
-          <w:numId w:val="1014"/>
+          <w:numId w:val="1015"/>
         </w:numPr>
       </w:pPr>
       <w:r>
@@ -12450,7 +13784,7 @@
         <w:pStyle w:val="Compact"/>
         <w:numPr>
           <w:ilvl w:val="0"/>
-          <w:numId w:val="1014"/>
+          <w:numId w:val="1015"/>
         </w:numPr>
       </w:pPr>
       <w:r>
@@ -12462,7 +13796,7 @@
         <w:pStyle w:val="Compact"/>
         <w:numPr>
           <w:ilvl w:val="0"/>
-          <w:numId w:val="1014"/>
+          <w:numId w:val="1015"/>
         </w:numPr>
       </w:pPr>
       <w:r>
@@ -12474,7 +13808,7 @@
         <w:pStyle w:val="Compact"/>
         <w:numPr>
           <w:ilvl w:val="0"/>
-          <w:numId w:val="1014"/>
+          <w:numId w:val="1015"/>
         </w:numPr>
       </w:pPr>
       <w:r>
@@ -12486,7 +13820,7 @@
         <w:pStyle w:val="Compact"/>
         <w:numPr>
           <w:ilvl w:val="0"/>
-          <w:numId w:val="1014"/>
+          <w:numId w:val="1015"/>
         </w:numPr>
       </w:pPr>
       <w:r>
@@ -12498,7 +13832,7 @@
         <w:pStyle w:val="Compact"/>
         <w:numPr>
           <w:ilvl w:val="0"/>
-          <w:numId w:val="1014"/>
+          <w:numId w:val="1015"/>
         </w:numPr>
       </w:pPr>
       <w:r>
@@ -12510,7 +13844,7 @@
         <w:pStyle w:val="Compact"/>
         <w:numPr>
           <w:ilvl w:val="0"/>
-          <w:numId w:val="1014"/>
+          <w:numId w:val="1015"/>
         </w:numPr>
       </w:pPr>
       <w:r>
@@ -12522,7 +13856,7 @@
         <w:pStyle w:val="Compact"/>
         <w:numPr>
           <w:ilvl w:val="0"/>
-          <w:numId w:val="1014"/>
+          <w:numId w:val="1015"/>
         </w:numPr>
       </w:pPr>
       <w:r>
@@ -12587,7 +13921,7 @@
         <w:pStyle w:val="Compact"/>
         <w:numPr>
           <w:ilvl w:val="0"/>
-          <w:numId w:val="1015"/>
+          <w:numId w:val="1016"/>
         </w:numPr>
       </w:pPr>
       <w:r>
@@ -12599,7 +13933,7 @@
         <w:pStyle w:val="Compact"/>
         <w:numPr>
           <w:ilvl w:val="0"/>
-          <w:numId w:val="1015"/>
+          <w:numId w:val="1016"/>
         </w:numPr>
       </w:pPr>
       <w:r>
@@ -12611,7 +13945,7 @@
         <w:pStyle w:val="Compact"/>
         <w:numPr>
           <w:ilvl w:val="0"/>
-          <w:numId w:val="1015"/>
+          <w:numId w:val="1016"/>
         </w:numPr>
       </w:pPr>
       <w:r>
@@ -12623,7 +13957,7 @@
         <w:pStyle w:val="Compact"/>
         <w:numPr>
           <w:ilvl w:val="0"/>
-          <w:numId w:val="1015"/>
+          <w:numId w:val="1016"/>
         </w:numPr>
       </w:pPr>
       <w:r>
@@ -12635,7 +13969,7 @@
         <w:pStyle w:val="Compact"/>
         <w:numPr>
           <w:ilvl w:val="0"/>
-          <w:numId w:val="1015"/>
+          <w:numId w:val="1016"/>
         </w:numPr>
       </w:pPr>
       <w:r>
@@ -12647,7 +13981,7 @@
         <w:pStyle w:val="Compact"/>
         <w:numPr>
           <w:ilvl w:val="0"/>
-          <w:numId w:val="1015"/>
+          <w:numId w:val="1016"/>
         </w:numPr>
       </w:pPr>
       <w:r>
@@ -12659,7 +13993,7 @@
         <w:pStyle w:val="Compact"/>
         <w:numPr>
           <w:ilvl w:val="0"/>
-          <w:numId w:val="1015"/>
+          <w:numId w:val="1016"/>
         </w:numPr>
       </w:pPr>
       <w:r>
@@ -12671,7 +14005,7 @@
         <w:pStyle w:val="Compact"/>
         <w:numPr>
           <w:ilvl w:val="0"/>
-          <w:numId w:val="1015"/>
+          <w:numId w:val="1016"/>
         </w:numPr>
       </w:pPr>
       <w:r>
@@ -12710,8 +14044,8 @@
         <w:t xml:space="preserve"> </w:t>
       </w:r>
     </w:p>
-    <w:bookmarkEnd w:id="84"/>
-    <w:bookmarkStart w:id="85" w:name="X97f52ace5da799f17238d7a7ea8f854d664df56"/>
+    <w:bookmarkEnd w:id="88"/>
+    <w:bookmarkStart w:id="89" w:name="X97f52ace5da799f17238d7a7ea8f854d664df56"/>
     <w:p>
       <w:pPr>
         <w:pStyle w:val="Heading4"/>
@@ -12758,7 +14092,7 @@
         <w:pStyle w:val="Compact"/>
         <w:numPr>
           <w:ilvl w:val="0"/>
-          <w:numId w:val="1016"/>
+          <w:numId w:val="1017"/>
         </w:numPr>
       </w:pPr>
       <w:r>
@@ -12770,7 +14104,7 @@
         <w:pStyle w:val="Compact"/>
         <w:numPr>
           <w:ilvl w:val="0"/>
-          <w:numId w:val="1016"/>
+          <w:numId w:val="1017"/>
         </w:numPr>
       </w:pPr>
       <w:r>
@@ -12782,7 +14116,7 @@
         <w:pStyle w:val="Compact"/>
         <w:numPr>
           <w:ilvl w:val="0"/>
-          <w:numId w:val="1016"/>
+          <w:numId w:val="1017"/>
         </w:numPr>
       </w:pPr>
       <w:r>
@@ -12794,7 +14128,7 @@
         <w:pStyle w:val="Compact"/>
         <w:numPr>
           <w:ilvl w:val="0"/>
-          <w:numId w:val="1016"/>
+          <w:numId w:val="1017"/>
         </w:numPr>
       </w:pPr>
       <w:r>
@@ -12806,7 +14140,7 @@
         <w:pStyle w:val="Compact"/>
         <w:numPr>
           <w:ilvl w:val="0"/>
-          <w:numId w:val="1016"/>
+          <w:numId w:val="1017"/>
         </w:numPr>
       </w:pPr>
       <w:r>
@@ -12845,8 +14179,8 @@
         <w:t xml:space="preserve"> </w:t>
       </w:r>
     </w:p>
-    <w:bookmarkEnd w:id="85"/>
-    <w:bookmarkStart w:id="86" w:name="Xec2a7319e9bf60f6cf9392f52a65ec34a2b7ffe"/>
+    <w:bookmarkEnd w:id="89"/>
+    <w:bookmarkStart w:id="90" w:name="Xec2a7319e9bf60f6cf9392f52a65ec34a2b7ffe"/>
     <w:p>
       <w:pPr>
         <w:pStyle w:val="Heading4"/>
@@ -12885,7 +14219,7 @@
         <w:pStyle w:val="Compact"/>
         <w:numPr>
           <w:ilvl w:val="0"/>
-          <w:numId w:val="1017"/>
+          <w:numId w:val="1018"/>
         </w:numPr>
       </w:pPr>
       <w:r>
@@ -12924,8 +14258,8 @@
         <w:t xml:space="preserve"> </w:t>
       </w:r>
     </w:p>
-    <w:bookmarkEnd w:id="86"/>
-    <w:bookmarkStart w:id="87" w:name="X8911d966885e7055db6f70194232771ce217e6e"/>
+    <w:bookmarkEnd w:id="90"/>
+    <w:bookmarkStart w:id="91" w:name="X8911d966885e7055db6f70194232771ce217e6e"/>
     <w:p>
       <w:pPr>
         <w:pStyle w:val="Heading4"/>
@@ -12964,7 +14298,7 @@
         <w:pStyle w:val="Compact"/>
         <w:numPr>
           <w:ilvl w:val="0"/>
-          <w:numId w:val="1018"/>
+          <w:numId w:val="1019"/>
         </w:numPr>
       </w:pPr>
       <w:r>
@@ -13003,8 +14337,8 @@
         <w:t xml:space="preserve"> </w:t>
       </w:r>
     </w:p>
-    <w:bookmarkEnd w:id="87"/>
-    <w:bookmarkStart w:id="88" w:name="X1212e2446175f34e3da2306ad1743f87c0efafe"/>
+    <w:bookmarkEnd w:id="91"/>
+    <w:bookmarkStart w:id="92" w:name="X1212e2446175f34e3da2306ad1743f87c0efafe"/>
     <w:p>
       <w:pPr>
         <w:pStyle w:val="Heading4"/>
@@ -13051,7 +14385,7 @@
         <w:pStyle w:val="Compact"/>
         <w:numPr>
           <w:ilvl w:val="0"/>
-          <w:numId w:val="1019"/>
+          <w:numId w:val="1020"/>
         </w:numPr>
       </w:pPr>
       <w:r>
@@ -13063,7 +14397,7 @@
         <w:pStyle w:val="Compact"/>
         <w:numPr>
           <w:ilvl w:val="0"/>
-          <w:numId w:val="1019"/>
+          <w:numId w:val="1020"/>
         </w:numPr>
       </w:pPr>
       <w:r>
@@ -13075,7 +14409,7 @@
         <w:pStyle w:val="Compact"/>
         <w:numPr>
           <w:ilvl w:val="0"/>
-          <w:numId w:val="1019"/>
+          <w:numId w:val="1020"/>
         </w:numPr>
       </w:pPr>
       <w:r>
@@ -13087,7 +14421,7 @@
         <w:pStyle w:val="Compact"/>
         <w:numPr>
           <w:ilvl w:val="0"/>
-          <w:numId w:val="1019"/>
+          <w:numId w:val="1020"/>
         </w:numPr>
       </w:pPr>
       <w:r>
@@ -13126,8 +14460,8 @@
         <w:t xml:space="preserve"> </w:t>
       </w:r>
     </w:p>
-    <w:bookmarkEnd w:id="88"/>
-    <w:bookmarkStart w:id="89" w:name="X76c29bc08001edfe28c253ac77e96b63b8001d4"/>
+    <w:bookmarkEnd w:id="92"/>
+    <w:bookmarkStart w:id="93" w:name="X76c29bc08001edfe28c253ac77e96b63b8001d4"/>
     <w:p>
       <w:pPr>
         <w:pStyle w:val="Heading4"/>
@@ -13572,8 +14906,8 @@
         <w:t xml:space="preserve"> </w:t>
       </w:r>
     </w:p>
-    <w:bookmarkEnd w:id="89"/>
-    <w:bookmarkStart w:id="90" w:name="X69669116aea1110529b51b1b3e7b1969ec6576d"/>
+    <w:bookmarkEnd w:id="93"/>
+    <w:bookmarkStart w:id="94" w:name="X69669116aea1110529b51b1b3e7b1969ec6576d"/>
     <w:p>
       <w:pPr>
         <w:pStyle w:val="Heading4"/>
@@ -13628,31 +14962,11 @@
         <w:pStyle w:val="Compact"/>
         <w:numPr>
           <w:ilvl w:val="0"/>
-          <w:numId w:val="1020"/>
+          <w:numId w:val="1021"/>
         </w:numPr>
       </w:pPr>
       <w:r>
         <w:t xml:space="preserve">T1 in PPG_ALC_CONFIG_PARAM_1 register.</w:t>
-      </w:r>
-    </w:p>
-    <w:p>
-      <w:pPr>
-        <w:pStyle w:val="Compact"/>
-        <w:numPr>
-          <w:ilvl w:val="0"/>
-          <w:numId w:val="1020"/>
-        </w:numPr>
-      </w:pPr>
-      <w:r>
-        <w:t xml:space="preserve">T2, GAIN_START_SET, GAIN_MAX_SET in PPG_ALC_CONFIG_PARAM_2 register.</w:t>
-      </w:r>
-    </w:p>
-    <w:p>
-      <w:pPr>
-        <w:pStyle w:val="FirstParagraph"/>
-      </w:pPr>
-      <w:r>
-        <w:t xml:space="preserve">5.2 DIGITAL RAMP PARAMETERS:</w:t>
       </w:r>
     </w:p>
     <w:p>
@@ -13664,39 +14978,15 @@
         </w:numPr>
       </w:pPr>
       <w:r>
-        <w:t xml:space="preserve">N_MAX, T_DELTA in DIGITAL_RAMP_CONFIG_PARAM_1 register.</w:t>
+        <w:t xml:space="preserve">T2, GAIN_START_SET, GAIN_MAX_SET in PPG_ALC_CONFIG_PARAM_2 register.</w:t>
       </w:r>
     </w:p>
     <w:p>
       <w:pPr>
-        <w:pStyle w:val="Compact"/>
-        <w:numPr>
-          <w:ilvl w:val="0"/>
-          <w:numId w:val="1021"/>
-        </w:numPr>
+        <w:pStyle w:val="FirstParagraph"/>
       </w:pPr>
       <w:r>
-        <w:t xml:space="preserve">DELTA, T_DELTA1 in DIGITAL_RAMP_CONFIG_PARAM_2 register.</w:t>
-      </w:r>
-    </w:p>
-    <w:p>
-      <w:pPr>
-        <w:pStyle w:val="Compact"/>
-        <w:numPr>
-          <w:ilvl w:val="0"/>
-          <w:numId w:val="1021"/>
-        </w:numPr>
-      </w:pPr>
-      <w:r>
-        <w:t xml:space="preserve">DELTA1 in DIGITAL_RAMP_CONFIG_PARAM_3 register.</w:t>
-      </w:r>
-    </w:p>
-    <w:p>
-      <w:pPr>
-        <w:pStyle w:val="FirstParagraph"/>
-      </w:pPr>
-      <w:r>
-        <w:t xml:space="preserve">5.3 GENERAL PPG PARAMETERS:</w:t>
+        <w:t xml:space="preserve">5.2 DIGITAL RAMP PARAMETERS:</w:t>
       </w:r>
     </w:p>
     <w:p>
@@ -13708,7 +14998,7 @@
         </w:numPr>
       </w:pPr>
       <w:r>
-        <w:t xml:space="preserve">N_PPG_FRAME, WAVE_VELOCITY_MODE, SEL_PPG_ELAB in GENERAL_PPG_PARAMETERS_1 register.</w:t>
+        <w:t xml:space="preserve">N_MAX, T_DELTA in DIGITAL_RAMP_CONFIG_PARAM_1 register.</w:t>
       </w:r>
     </w:p>
     <w:p>
@@ -13720,7 +15010,7 @@
         </w:numPr>
       </w:pPr>
       <w:r>
-        <w:t xml:space="preserve">T_TX_STARTUP in GENERAL_PPG_PARAMETERS_2 register.</w:t>
+        <w:t xml:space="preserve">DELTA, T_DELTA1 in DIGITAL_RAMP_CONFIG_PARAM_2 register.</w:t>
       </w:r>
     </w:p>
     <w:p>
@@ -13732,27 +15022,15 @@
         </w:numPr>
       </w:pPr>
       <w:r>
-        <w:t xml:space="preserve">T_RX_SET, PPG_START_UP_TIME_l in GENERAL_PPG_PARAMETERS_3 register.</w:t>
+        <w:t xml:space="preserve">DELTA1 in DIGITAL_RAMP_CONFIG_PARAM_3 register.</w:t>
       </w:r>
     </w:p>
     <w:p>
       <w:pPr>
-        <w:pStyle w:val="Compact"/>
-        <w:numPr>
-          <w:ilvl w:val="0"/>
-          <w:numId w:val="1022"/>
-        </w:numPr>
+        <w:pStyle w:val="FirstParagraph"/>
       </w:pPr>
       <w:r>
-        <w:t xml:space="preserve">PPG_START_UP_TIME_h in GENERAL_PPG_PARAMETERS_4 register.</w:t>
-      </w:r>
-    </w:p>
-    <w:p>
-      <w:pPr>
-        <w:pStyle w:val="FirstParagraph"/>
-      </w:pPr>
-      <w:r>
-        <w:t xml:space="preserve">5.4 PARAMETERS FOR EACH FRAME CONFIGURED BY USER:</w:t>
+        <w:t xml:space="preserve">5.3 GENERAL PPG PARAMETERS:</w:t>
       </w:r>
     </w:p>
     <w:p>
@@ -13761,6 +15039,62 @@
         <w:numPr>
           <w:ilvl w:val="0"/>
           <w:numId w:val="1023"/>
+        </w:numPr>
+      </w:pPr>
+      <w:r>
+        <w:t xml:space="preserve">N_PPG_FRAME, WAVE_VELOCITY_MODE, SEL_PPG_ELAB in GENERAL_PPG_PARAMETERS_1 register.</w:t>
+      </w:r>
+    </w:p>
+    <w:p>
+      <w:pPr>
+        <w:pStyle w:val="Compact"/>
+        <w:numPr>
+          <w:ilvl w:val="0"/>
+          <w:numId w:val="1023"/>
+        </w:numPr>
+      </w:pPr>
+      <w:r>
+        <w:t xml:space="preserve">T_TX_STARTUP in GENERAL_PPG_PARAMETERS_2 register.</w:t>
+      </w:r>
+    </w:p>
+    <w:p>
+      <w:pPr>
+        <w:pStyle w:val="Compact"/>
+        <w:numPr>
+          <w:ilvl w:val="0"/>
+          <w:numId w:val="1023"/>
+        </w:numPr>
+      </w:pPr>
+      <w:r>
+        <w:t xml:space="preserve">T_RX_SET, PPG_START_UP_TIME_l in GENERAL_PPG_PARAMETERS_3 register.</w:t>
+      </w:r>
+    </w:p>
+    <w:p>
+      <w:pPr>
+        <w:pStyle w:val="Compact"/>
+        <w:numPr>
+          <w:ilvl w:val="0"/>
+          <w:numId w:val="1023"/>
+        </w:numPr>
+      </w:pPr>
+      <w:r>
+        <w:t xml:space="preserve">PPG_START_UP_TIME_h in GENERAL_PPG_PARAMETERS_4 register.</w:t>
+      </w:r>
+    </w:p>
+    <w:p>
+      <w:pPr>
+        <w:pStyle w:val="FirstParagraph"/>
+      </w:pPr>
+      <w:r>
+        <w:t xml:space="preserve">5.4 PARAMETERS FOR EACH FRAME CONFIGURED BY USER:</w:t>
+      </w:r>
+    </w:p>
+    <w:p>
+      <w:pPr>
+        <w:pStyle w:val="Compact"/>
+        <w:numPr>
+          <w:ilvl w:val="0"/>
+          <w:numId w:val="1024"/>
         </w:numPr>
       </w:pPr>
       <w:r>
@@ -13782,7 +15116,7 @@
         <w:pStyle w:val="Compact"/>
         <w:numPr>
           <w:ilvl w:val="0"/>
-          <w:numId w:val="1023"/>
+          <w:numId w:val="1024"/>
         </w:numPr>
       </w:pPr>
       <w:r>
@@ -13794,7 +15128,7 @@
         <w:pStyle w:val="Compact"/>
         <w:numPr>
           <w:ilvl w:val="0"/>
-          <w:numId w:val="1023"/>
+          <w:numId w:val="1024"/>
         </w:numPr>
       </w:pPr>
       <w:r>
@@ -13806,7 +15140,7 @@
         <w:pStyle w:val="Compact"/>
         <w:numPr>
           <w:ilvl w:val="0"/>
-          <w:numId w:val="1023"/>
+          <w:numId w:val="1024"/>
         </w:numPr>
       </w:pPr>
       <w:r>
@@ -13818,7 +15152,7 @@
         <w:pStyle w:val="Compact"/>
         <w:numPr>
           <w:ilvl w:val="0"/>
-          <w:numId w:val="1023"/>
+          <w:numId w:val="1024"/>
         </w:numPr>
       </w:pPr>
       <w:r>
@@ -13830,7 +15164,7 @@
         <w:pStyle w:val="Compact"/>
         <w:numPr>
           <w:ilvl w:val="0"/>
-          <w:numId w:val="1023"/>
+          <w:numId w:val="1024"/>
         </w:numPr>
       </w:pPr>
       <w:r>
@@ -13842,7 +15176,7 @@
         <w:pStyle w:val="Compact"/>
         <w:numPr>
           <w:ilvl w:val="0"/>
-          <w:numId w:val="1023"/>
+          <w:numId w:val="1024"/>
         </w:numPr>
       </w:pPr>
       <w:r>
@@ -13854,7 +15188,7 @@
         <w:pStyle w:val="Compact"/>
         <w:numPr>
           <w:ilvl w:val="0"/>
-          <w:numId w:val="1023"/>
+          <w:numId w:val="1024"/>
         </w:numPr>
       </w:pPr>
       <w:r>
@@ -13893,8 +15227,8 @@
         <w:t xml:space="preserve"> </w:t>
       </w:r>
     </w:p>
-    <w:bookmarkEnd w:id="90"/>
-    <w:bookmarkStart w:id="91" w:name="X5983f4e01355256eeed2232f3d5e1abfc34b666"/>
+    <w:bookmarkEnd w:id="94"/>
+    <w:bookmarkStart w:id="95" w:name="X5983f4e01355256eeed2232f3d5e1abfc34b666"/>
     <w:p>
       <w:pPr>
         <w:pStyle w:val="Heading4"/>
@@ -13933,7 +15267,7 @@
         <w:pStyle w:val="Compact"/>
         <w:numPr>
           <w:ilvl w:val="0"/>
-          <w:numId w:val="1024"/>
+          <w:numId w:val="1025"/>
         </w:numPr>
       </w:pPr>
       <w:r>
@@ -13972,8 +15306,8 @@
         <w:t xml:space="preserve"> </w:t>
       </w:r>
     </w:p>
-    <w:bookmarkEnd w:id="91"/>
-    <w:bookmarkStart w:id="92" w:name="Xc1735d414ff8f07c3bd57fbdc5f053ed8b885e7"/>
+    <w:bookmarkEnd w:id="95"/>
+    <w:bookmarkStart w:id="96" w:name="Xc1735d414ff8f07c3bd57fbdc5f053ed8b885e7"/>
     <w:p>
       <w:pPr>
         <w:pStyle w:val="Heading4"/>
@@ -14012,7 +15346,7 @@
         <w:pStyle w:val="Compact"/>
         <w:numPr>
           <w:ilvl w:val="0"/>
-          <w:numId w:val="1025"/>
+          <w:numId w:val="1026"/>
         </w:numPr>
       </w:pPr>
       <w:r>
@@ -14051,8 +15385,8 @@
         <w:t xml:space="preserve"> </w:t>
       </w:r>
     </w:p>
-    <w:bookmarkEnd w:id="92"/>
-    <w:bookmarkStart w:id="93" w:name="Xc7c9a407099e2fa284ae49521f788bd9487ccc3"/>
+    <w:bookmarkEnd w:id="96"/>
+    <w:bookmarkStart w:id="97" w:name="Xc7c9a407099e2fa284ae49521f788bd9487ccc3"/>
     <w:p>
       <w:pPr>
         <w:pStyle w:val="Heading4"/>
@@ -14091,7 +15425,7 @@
         <w:pStyle w:val="Compact"/>
         <w:numPr>
           <w:ilvl w:val="0"/>
-          <w:numId w:val="1026"/>
+          <w:numId w:val="1027"/>
         </w:numPr>
       </w:pPr>
       <w:r>
@@ -14130,8 +15464,8 @@
         <w:t xml:space="preserve"> </w:t>
       </w:r>
     </w:p>
-    <w:bookmarkEnd w:id="93"/>
-    <w:bookmarkStart w:id="94" w:name="X640648e4f38bb2ca7e0ee28f596cc191ef3b245"/>
+    <w:bookmarkEnd w:id="97"/>
+    <w:bookmarkStart w:id="98" w:name="X640648e4f38bb2ca7e0ee28f596cc191ef3b245"/>
     <w:p>
       <w:pPr>
         <w:pStyle w:val="Heading4"/>
@@ -14178,7 +15512,7 @@
         <w:pStyle w:val="Compact"/>
         <w:numPr>
           <w:ilvl w:val="0"/>
-          <w:numId w:val="1027"/>
+          <w:numId w:val="1028"/>
         </w:numPr>
       </w:pPr>
       <w:r>
@@ -14190,7 +15524,7 @@
         <w:pStyle w:val="Compact"/>
         <w:numPr>
           <w:ilvl w:val="0"/>
-          <w:numId w:val="1027"/>
+          <w:numId w:val="1028"/>
         </w:numPr>
       </w:pPr>
       <w:r>
@@ -14202,7 +15536,7 @@
         <w:pStyle w:val="Compact"/>
         <w:numPr>
           <w:ilvl w:val="0"/>
-          <w:numId w:val="1027"/>
+          <w:numId w:val="1028"/>
         </w:numPr>
       </w:pPr>
       <w:r>
@@ -14214,7 +15548,7 @@
         <w:pStyle w:val="Compact"/>
         <w:numPr>
           <w:ilvl w:val="0"/>
-          <w:numId w:val="1027"/>
+          <w:numId w:val="1028"/>
         </w:numPr>
       </w:pPr>
       <w:r>
@@ -14253,8 +15587,8 @@
         <w:t xml:space="preserve"> </w:t>
       </w:r>
     </w:p>
-    <w:bookmarkEnd w:id="94"/>
-    <w:bookmarkStart w:id="95" w:name="Xd55da7251358860af901b08ec53e0365cc105c2"/>
+    <w:bookmarkEnd w:id="98"/>
+    <w:bookmarkStart w:id="99" w:name="Xd55da7251358860af901b08ec53e0365cc105c2"/>
     <w:p>
       <w:pPr>
         <w:pStyle w:val="Heading4"/>
@@ -14293,7 +15627,7 @@
         <w:pStyle w:val="Compact"/>
         <w:numPr>
           <w:ilvl w:val="0"/>
-          <w:numId w:val="1028"/>
+          <w:numId w:val="1029"/>
         </w:numPr>
       </w:pPr>
       <w:r>
@@ -14332,8 +15666,8 @@
         <w:t xml:space="preserve"> </w:t>
       </w:r>
     </w:p>
-    <w:bookmarkEnd w:id="95"/>
-    <w:bookmarkStart w:id="96" w:name="Xf69ee5f18eb09c400b0c0dc927d0088ec8068ac"/>
+    <w:bookmarkEnd w:id="99"/>
+    <w:bookmarkStart w:id="100" w:name="Xf69ee5f18eb09c400b0c0dc927d0088ec8068ac"/>
     <w:p>
       <w:pPr>
         <w:pStyle w:val="Heading4"/>
@@ -14346,10 +15680,10 @@
         <w:t xml:space="preserve">6.4.14 XBAR Connection Matrix</w:t>
       </w:r>
     </w:p>
-    <w:bookmarkEnd w:id="96"/>
-    <w:bookmarkEnd w:id="97"/>
-    <w:bookmarkEnd w:id="98"/>
-    <w:bookmarkStart w:id="99" w:name="X47682fa8e01d402a12f3badde71a5245b02c5fc"/>
+    <w:bookmarkEnd w:id="100"/>
+    <w:bookmarkEnd w:id="101"/>
+    <w:bookmarkEnd w:id="102"/>
+    <w:bookmarkStart w:id="103" w:name="X47682fa8e01d402a12f3badde71a5245b02c5fc"/>
     <w:p>
       <w:pPr>
         <w:pStyle w:val="Heading2"/>
@@ -15136,8 +16470,8 @@
         <w:t xml:space="preserve"> </w:t>
       </w:r>
     </w:p>
-    <w:bookmarkEnd w:id="99"/>
-    <w:bookmarkStart w:id="100" w:name="X5e87c6980ed91cc3e7ba3e39c2d7b456b7be1cb"/>
+    <w:bookmarkEnd w:id="103"/>
+    <w:bookmarkStart w:id="104" w:name="X5e87c6980ed91cc3e7ba3e39c2d7b456b7be1cb"/>
     <w:p>
       <w:pPr>
         <w:pStyle w:val="Heading2"/>
@@ -15155,15 +16489,15 @@
         <w:pStyle w:val="Compact"/>
         <w:numPr>
           <w:ilvl w:val="0"/>
-          <w:numId w:val="1029"/>
+          <w:numId w:val="1030"/>
         </w:numPr>
       </w:pPr>
       <w:r>
         <w:t xml:space="preserve">ASSUME-001: Firmware and verification environments provide deterministic digital stimulus and observability.</w:t>
       </w:r>
     </w:p>
-    <w:bookmarkEnd w:id="100"/>
-    <w:bookmarkStart w:id="113" w:name="Xb2f0bd388c178dc19d937dae3425521ec5aa63d"/>
+    <w:bookmarkEnd w:id="104"/>
+    <w:bookmarkStart w:id="117" w:name="Xb2f0bd388c178dc19d937dae3425521ec5aa63d"/>
     <w:p>
       <w:pPr>
         <w:pStyle w:val="Heading2"/>
@@ -16129,7 +17463,7 @@
         <w:t xml:space="preserve">[End]</w:t>
       </w:r>
     </w:p>
-    <w:bookmarkStart w:id="101" w:name="X4367c28d3bf9bf96691c127f65c3fb2ddc71a62"/>
+    <w:bookmarkStart w:id="105" w:name="X4367c28d3bf9bf96691c127f65c3fb2ddc71a62"/>
     <w:p>
       <w:pPr>
         <w:pStyle w:val="Heading3"/>
@@ -16171,7 +17505,7 @@
         <w:pStyle w:val="Compact"/>
         <w:numPr>
           <w:ilvl w:val="0"/>
-          <w:numId w:val="1030"/>
+          <w:numId w:val="1031"/>
         </w:numPr>
       </w:pPr>
       <w:r>
@@ -18353,8 +19687,8 @@
         <w:t xml:space="preserve">[End]</w:t>
       </w:r>
     </w:p>
-    <w:bookmarkEnd w:id="101"/>
-    <w:bookmarkStart w:id="102" w:name="Xf04708f5572fc9964607232c1732ec67ea8282d"/>
+    <w:bookmarkEnd w:id="105"/>
+    <w:bookmarkStart w:id="106" w:name="Xf04708f5572fc9964607232c1732ec67ea8282d"/>
     <w:p>
       <w:pPr>
         <w:pStyle w:val="Heading3"/>
@@ -18396,7 +19730,7 @@
         <w:pStyle w:val="Compact"/>
         <w:numPr>
           <w:ilvl w:val="0"/>
-          <w:numId w:val="1031"/>
+          <w:numId w:val="1032"/>
         </w:numPr>
       </w:pPr>
       <w:r>
@@ -20508,8 +21842,8 @@
         <w:t xml:space="preserve">[End]</w:t>
       </w:r>
     </w:p>
-    <w:bookmarkEnd w:id="102"/>
-    <w:bookmarkStart w:id="103" w:name="X3c0d092f692fe32d59810a1bbf86f15099aa5c6"/>
+    <w:bookmarkEnd w:id="106"/>
+    <w:bookmarkStart w:id="107" w:name="X3c0d092f692fe32d59810a1bbf86f15099aa5c6"/>
     <w:p>
       <w:pPr>
         <w:pStyle w:val="Heading3"/>
@@ -20551,7 +21885,7 @@
         <w:pStyle w:val="Compact"/>
         <w:numPr>
           <w:ilvl w:val="0"/>
-          <w:numId w:val="1032"/>
+          <w:numId w:val="1033"/>
         </w:numPr>
       </w:pPr>
       <w:r>
@@ -26909,7 +28243,7 @@
         <w:pStyle w:val="Compact"/>
         <w:numPr>
           <w:ilvl w:val="0"/>
-          <w:numId w:val="1033"/>
+          <w:numId w:val="1034"/>
         </w:numPr>
       </w:pPr>
       <w:r>
@@ -37363,7 +38697,7 @@
         <w:pStyle w:val="Compact"/>
         <w:numPr>
           <w:ilvl w:val="0"/>
-          <w:numId w:val="1034"/>
+          <w:numId w:val="1035"/>
         </w:numPr>
       </w:pPr>
       <w:r>
@@ -37420,7 +38754,7 @@
         <w:pStyle w:val="Compact"/>
         <w:numPr>
           <w:ilvl w:val="0"/>
-          <w:numId w:val="1035"/>
+          <w:numId w:val="1036"/>
         </w:numPr>
       </w:pPr>
       <w:r>
@@ -37488,8 +38822,8 @@
         <w:t xml:space="preserve">[End]</w:t>
       </w:r>
     </w:p>
-    <w:bookmarkEnd w:id="103"/>
-    <w:bookmarkStart w:id="104" w:name="X5657cf48bcefe145c2145dd466747d416f38959"/>
+    <w:bookmarkEnd w:id="107"/>
+    <w:bookmarkStart w:id="108" w:name="X5657cf48bcefe145c2145dd466747d416f38959"/>
     <w:p>
       <w:pPr>
         <w:pStyle w:val="Heading3"/>
@@ -37531,7 +38865,7 @@
         <w:pStyle w:val="Compact"/>
         <w:numPr>
           <w:ilvl w:val="0"/>
-          <w:numId w:val="1036"/>
+          <w:numId w:val="1037"/>
         </w:numPr>
       </w:pPr>
       <w:r>
@@ -38574,8 +39908,8 @@
         <w:t xml:space="preserve"> </w:t>
       </w:r>
     </w:p>
-    <w:bookmarkEnd w:id="104"/>
-    <w:bookmarkStart w:id="105" w:name="Xc83a3228768b310055f2548c2f7a9b5e29cb803"/>
+    <w:bookmarkEnd w:id="108"/>
+    <w:bookmarkStart w:id="109" w:name="Xc83a3228768b310055f2548c2f7a9b5e29cb803"/>
     <w:p>
       <w:pPr>
         <w:pStyle w:val="Heading3"/>
@@ -38630,7 +39964,7 @@
         <w:pStyle w:val="Compact"/>
         <w:numPr>
           <w:ilvl w:val="0"/>
-          <w:numId w:val="1037"/>
+          <w:numId w:val="1038"/>
         </w:numPr>
       </w:pPr>
       <w:r>
@@ -38687,7 +40021,7 @@
         <w:pStyle w:val="Compact"/>
         <w:numPr>
           <w:ilvl w:val="0"/>
-          <w:numId w:val="1038"/>
+          <w:numId w:val="1039"/>
         </w:numPr>
       </w:pPr>
       <w:r>
@@ -38699,7 +40033,7 @@
         <w:pStyle w:val="Compact"/>
         <w:numPr>
           <w:ilvl w:val="0"/>
-          <w:numId w:val="1038"/>
+          <w:numId w:val="1039"/>
         </w:numPr>
       </w:pPr>
       <w:r>
@@ -38711,7 +40045,7 @@
         <w:pStyle w:val="Compact"/>
         <w:numPr>
           <w:ilvl w:val="0"/>
-          <w:numId w:val="1038"/>
+          <w:numId w:val="1039"/>
         </w:numPr>
       </w:pPr>
       <w:r>
@@ -38723,7 +40057,7 @@
         <w:pStyle w:val="Compact"/>
         <w:numPr>
           <w:ilvl w:val="0"/>
-          <w:numId w:val="1038"/>
+          <w:numId w:val="1039"/>
         </w:numPr>
       </w:pPr>
       <w:r>
@@ -38735,7 +40069,7 @@
         <w:pStyle w:val="Compact"/>
         <w:numPr>
           <w:ilvl w:val="0"/>
-          <w:numId w:val="1038"/>
+          <w:numId w:val="1039"/>
         </w:numPr>
       </w:pPr>
       <w:r>
@@ -38758,8 +40092,8 @@
         <w:t xml:space="preserve">[End]</w:t>
       </w:r>
     </w:p>
-    <w:bookmarkEnd w:id="105"/>
-    <w:bookmarkStart w:id="106" w:name="X75daeb0daac82d5128b73cbf92bbd6321901b64"/>
+    <w:bookmarkEnd w:id="109"/>
+    <w:bookmarkStart w:id="110" w:name="X75daeb0daac82d5128b73cbf92bbd6321901b64"/>
     <w:p>
       <w:pPr>
         <w:pStyle w:val="Heading3"/>
@@ -38788,8 +40122,8 @@
         <w:t xml:space="preserve"> </w:t>
       </w:r>
     </w:p>
-    <w:bookmarkEnd w:id="106"/>
-    <w:bookmarkStart w:id="107" w:name="Xbdeb9cc6c3538f4a8aad23dcb4226243b7d0915"/>
+    <w:bookmarkEnd w:id="110"/>
+    <w:bookmarkStart w:id="111" w:name="Xbdeb9cc6c3538f4a8aad23dcb4226243b7d0915"/>
     <w:p>
       <w:pPr>
         <w:pStyle w:val="Heading3"/>
@@ -38831,7 +40165,7 @@
         <w:pStyle w:val="Compact"/>
         <w:numPr>
           <w:ilvl w:val="0"/>
-          <w:numId w:val="1039"/>
+          <w:numId w:val="1040"/>
         </w:numPr>
       </w:pPr>
       <w:r>
@@ -43316,7 +44650,7 @@
         <w:pStyle w:val="Compact"/>
         <w:numPr>
           <w:ilvl w:val="0"/>
-          <w:numId w:val="1040"/>
+          <w:numId w:val="1041"/>
         </w:numPr>
       </w:pPr>
       <w:r>
@@ -48094,8 +49428,8 @@
         <w:t xml:space="preserve"> </w:t>
       </w:r>
     </w:p>
-    <w:bookmarkEnd w:id="107"/>
-    <w:bookmarkStart w:id="108" w:name="X4c7c663c791cffc72817d873b2acfd64cc0f222"/>
+    <w:bookmarkEnd w:id="111"/>
+    <w:bookmarkStart w:id="112" w:name="X4c7c663c791cffc72817d873b2acfd64cc0f222"/>
     <w:p>
       <w:pPr>
         <w:pStyle w:val="Heading3"/>
@@ -48124,8 +49458,8 @@
         <w:t xml:space="preserve"> </w:t>
       </w:r>
     </w:p>
-    <w:bookmarkEnd w:id="108"/>
-    <w:bookmarkStart w:id="109" w:name="Xff3e9123ca50689e9e08955532868a42327d554"/>
+    <w:bookmarkEnd w:id="112"/>
+    <w:bookmarkStart w:id="113" w:name="Xff3e9123ca50689e9e08955532868a42327d554"/>
     <w:p>
       <w:pPr>
         <w:pStyle w:val="Heading3"/>
@@ -48167,7 +49501,7 @@
         <w:pStyle w:val="Compact"/>
         <w:numPr>
           <w:ilvl w:val="0"/>
-          <w:numId w:val="1041"/>
+          <w:numId w:val="1042"/>
         </w:numPr>
       </w:pPr>
       <w:r>
@@ -50047,8 +51381,8 @@
         <w:t xml:space="preserve"> </w:t>
       </w:r>
     </w:p>
-    <w:bookmarkEnd w:id="109"/>
-    <w:bookmarkStart w:id="110" w:name="X0decda037ab1d094d4cccee532eef2f794c417a"/>
+    <w:bookmarkEnd w:id="113"/>
+    <w:bookmarkStart w:id="114" w:name="X0decda037ab1d094d4cccee532eef2f794c417a"/>
     <w:p>
       <w:pPr>
         <w:pStyle w:val="Heading3"/>
@@ -51018,7 +52352,7 @@
         <w:pStyle w:val="Compact"/>
         <w:numPr>
           <w:ilvl w:val="0"/>
-          <w:numId w:val="1042"/>
+          <w:numId w:val="1043"/>
         </w:numPr>
       </w:pPr>
       <w:r>
@@ -51030,7 +52364,7 @@
         <w:pStyle w:val="Compact"/>
         <w:numPr>
           <w:ilvl w:val="0"/>
-          <w:numId w:val="1042"/>
+          <w:numId w:val="1043"/>
         </w:numPr>
       </w:pPr>
       <w:r>
@@ -51042,7 +52376,7 @@
         <w:pStyle w:val="Compact"/>
         <w:numPr>
           <w:ilvl w:val="0"/>
-          <w:numId w:val="1042"/>
+          <w:numId w:val="1043"/>
         </w:numPr>
       </w:pPr>
       <w:r>
@@ -51110,8 +52444,8 @@
         <w:t xml:space="preserve">[End]</w:t>
       </w:r>
     </w:p>
-    <w:bookmarkEnd w:id="110"/>
-    <w:bookmarkStart w:id="111" w:name="X9dfd29372511a3468c83c24f515d5561e6d55f5"/>
+    <w:bookmarkEnd w:id="114"/>
+    <w:bookmarkStart w:id="115" w:name="X9dfd29372511a3468c83c24f515d5561e6d55f5"/>
     <w:p>
       <w:pPr>
         <w:pStyle w:val="Heading3"/>
@@ -51153,7 +52487,7 @@
         <w:pStyle w:val="Compact"/>
         <w:numPr>
           <w:ilvl w:val="0"/>
-          <w:numId w:val="1043"/>
+          <w:numId w:val="1044"/>
         </w:numPr>
       </w:pPr>
       <w:r>
@@ -54050,7 +55384,7 @@
         <w:pStyle w:val="Compact"/>
         <w:numPr>
           <w:ilvl w:val="0"/>
-          <w:numId w:val="1044"/>
+          <w:numId w:val="1045"/>
         </w:numPr>
       </w:pPr>
       <w:r>
@@ -62324,8 +63658,8 @@
         <w:t xml:space="preserve"> </w:t>
       </w:r>
     </w:p>
-    <w:bookmarkEnd w:id="111"/>
-    <w:bookmarkStart w:id="112" w:name="X11daf15caf6e7b11010795cb3c040a236dc4f2b"/>
+    <w:bookmarkEnd w:id="115"/>
+    <w:bookmarkStart w:id="116" w:name="X11daf15caf6e7b11010795cb3c040a236dc4f2b"/>
     <w:p>
       <w:pPr>
         <w:pStyle w:val="Heading3"/>
@@ -62367,7 +63701,7 @@
         <w:pStyle w:val="Compact"/>
         <w:numPr>
           <w:ilvl w:val="0"/>
-          <w:numId w:val="1045"/>
+          <w:numId w:val="1046"/>
         </w:numPr>
       </w:pPr>
       <w:r>
@@ -66409,9 +67743,9 @@
         <w:t xml:space="preserve"> </w:t>
       </w:r>
     </w:p>
-    <w:bookmarkEnd w:id="112"/>
-    <w:bookmarkEnd w:id="113"/>
-    <w:bookmarkStart w:id="114" w:name="X795f7dcc139c07128ade036cddb2c6e557b47f2"/>
+    <w:bookmarkEnd w:id="116"/>
+    <w:bookmarkEnd w:id="117"/>
+    <w:bookmarkStart w:id="118" w:name="X795f7dcc139c07128ade036cddb2c6e557b47f2"/>
     <w:p>
       <w:pPr>
         <w:pStyle w:val="Heading2"/>
@@ -66429,15 +67763,15 @@
         <w:pStyle w:val="Compact"/>
         <w:numPr>
           <w:ilvl w:val="0"/>
-          <w:numId w:val="1046"/>
+          <w:numId w:val="1047"/>
         </w:numPr>
       </w:pPr>
       <w:r>
         <w:t xml:space="preserve">None</w:t>
       </w:r>
     </w:p>
-    <w:bookmarkEnd w:id="114"/>
-    <w:bookmarkEnd w:id="115"/>
+    <w:bookmarkEnd w:id="118"/>
+    <w:bookmarkEnd w:id="119"/>
     <w:sectPr>
       <w:headerReference r:id="rId14" w:type="default"/>
       <w:footerReference r:id="rId15" w:type="default"/>
@@ -68853,6 +70187,9 @@
     <w:abstractNumId w:val="991"/>
   </w:num>
   <w:num w:numId="1046">
+    <w:abstractNumId w:val="991"/>
+  </w:num>
+  <w:num w:numId="1047">
     <w:abstractNumId w:val="991"/>
   </w:num>
 </w:numbering>

</xml_diff>